<commit_message>
Se ingresan correcciones, se eliminan parafos, se unifican formatos y se agrega seccion Contact
</commit_message>
<xml_diff>
--- a/AB/Grants.docx
+++ b/AB/Grants.docx
@@ -6,6 +6,2379 @@
       <w:pPr>
         <w:pStyle w:val="Ttulo3"/>
         <w:spacing w:line="276" w:lineRule="auto"/>
+        <w:rPr>
+          <w:rStyle w:val="Textoennegrita"/>
+          <w:rFonts w:ascii="Palatino Linotype" w:hAnsi="Palatino Linotype"/>
+          <w:color w:val="000000"/>
+          <w:sz w:val="22"/>
+          <w:szCs w:val="22"/>
+          <w:lang w:val="en-US"/>
+        </w:rPr>
+      </w:pPr>
+      <w:r>
+        <w:rPr>
+          <w:rStyle w:val="Textoennegrita"/>
+          <w:rFonts w:ascii="Palatino Linotype" w:hAnsi="Palatino Linotype"/>
+          <w:color w:val="000000"/>
+          <w:sz w:val="22"/>
+          <w:szCs w:val="22"/>
+          <w:lang w:val="en-US"/>
+        </w:rPr>
+        <w:t xml:space="preserve">Para </w:t>
+      </w:r>
+      <w:r>
+        <w:rPr>
+          <w:rStyle w:val="Textoennegrita"/>
+          <w:rFonts w:ascii="Palatino Linotype" w:hAnsi="Palatino Linotype"/>
+          <w:color w:val="000000"/>
+          <w:sz w:val="22"/>
+          <w:szCs w:val="22"/>
+          <w:lang w:val="en-US"/>
+        </w:rPr>
+        <w:t xml:space="preserve">la </w:t>
+      </w:r>
+      <w:proofErr w:type="spellStart"/>
+      <w:r>
+        <w:rPr>
+          <w:rStyle w:val="Textoennegrita"/>
+          <w:rFonts w:ascii="Palatino Linotype" w:hAnsi="Palatino Linotype"/>
+          <w:color w:val="000000"/>
+          <w:sz w:val="22"/>
+          <w:szCs w:val="22"/>
+          <w:lang w:val="en-US"/>
+        </w:rPr>
+        <w:t>pagina</w:t>
+      </w:r>
+      <w:proofErr w:type="spellEnd"/>
+      <w:r>
+        <w:rPr>
+          <w:rStyle w:val="Textoennegrita"/>
+          <w:rFonts w:ascii="Palatino Linotype" w:hAnsi="Palatino Linotype"/>
+          <w:color w:val="000000"/>
+          <w:sz w:val="22"/>
+          <w:szCs w:val="22"/>
+          <w:lang w:val="en-US"/>
+        </w:rPr>
+        <w:t xml:space="preserve"> </w:t>
+      </w:r>
+      <w:r>
+        <w:rPr>
+          <w:rStyle w:val="Textoennegrita"/>
+          <w:rFonts w:ascii="Palatino Linotype" w:hAnsi="Palatino Linotype"/>
+          <w:color w:val="000000"/>
+          <w:sz w:val="22"/>
+          <w:szCs w:val="22"/>
+          <w:lang w:val="en-US"/>
+        </w:rPr>
+        <w:t xml:space="preserve">grant, </w:t>
+      </w:r>
+      <w:proofErr w:type="spellStart"/>
+      <w:r>
+        <w:rPr>
+          <w:rStyle w:val="Textoennegrita"/>
+          <w:rFonts w:ascii="Palatino Linotype" w:hAnsi="Palatino Linotype"/>
+          <w:color w:val="000000"/>
+          <w:sz w:val="22"/>
+          <w:szCs w:val="22"/>
+          <w:lang w:val="en-US"/>
+        </w:rPr>
+        <w:t>utiliza</w:t>
+      </w:r>
+      <w:proofErr w:type="spellEnd"/>
+      <w:r>
+        <w:rPr>
+          <w:rStyle w:val="Textoennegrita"/>
+          <w:rFonts w:ascii="Palatino Linotype" w:hAnsi="Palatino Linotype"/>
+          <w:color w:val="000000"/>
+          <w:sz w:val="22"/>
+          <w:szCs w:val="22"/>
+          <w:lang w:val="en-US"/>
+        </w:rPr>
+        <w:t xml:space="preserve"> </w:t>
+      </w:r>
+      <w:proofErr w:type="spellStart"/>
+      <w:r>
+        <w:rPr>
+          <w:rStyle w:val="Textoennegrita"/>
+          <w:rFonts w:ascii="Palatino Linotype" w:hAnsi="Palatino Linotype"/>
+          <w:color w:val="000000"/>
+          <w:sz w:val="22"/>
+          <w:szCs w:val="22"/>
+          <w:lang w:val="en-US"/>
+        </w:rPr>
+        <w:t>el</w:t>
+      </w:r>
+      <w:proofErr w:type="spellEnd"/>
+      <w:r>
+        <w:rPr>
+          <w:rStyle w:val="Textoennegrita"/>
+          <w:rFonts w:ascii="Palatino Linotype" w:hAnsi="Palatino Linotype"/>
+          <w:color w:val="000000"/>
+          <w:sz w:val="22"/>
+          <w:szCs w:val="22"/>
+          <w:lang w:val="en-US"/>
+        </w:rPr>
+        <w:t xml:space="preserve"> </w:t>
+      </w:r>
+      <w:proofErr w:type="spellStart"/>
+      <w:r>
+        <w:rPr>
+          <w:rStyle w:val="Textoennegrita"/>
+          <w:rFonts w:ascii="Palatino Linotype" w:hAnsi="Palatino Linotype"/>
+          <w:color w:val="000000"/>
+          <w:sz w:val="22"/>
+          <w:szCs w:val="22"/>
+          <w:lang w:val="en-US"/>
+        </w:rPr>
+        <w:t>mismo</w:t>
+      </w:r>
+      <w:proofErr w:type="spellEnd"/>
+      <w:r>
+        <w:rPr>
+          <w:rStyle w:val="Textoennegrita"/>
+          <w:rFonts w:ascii="Palatino Linotype" w:hAnsi="Palatino Linotype"/>
+          <w:color w:val="000000"/>
+          <w:sz w:val="22"/>
+          <w:szCs w:val="22"/>
+          <w:lang w:val="en-US"/>
+        </w:rPr>
+        <w:t xml:space="preserve"> </w:t>
+      </w:r>
+      <w:proofErr w:type="spellStart"/>
+      <w:r>
+        <w:rPr>
+          <w:rStyle w:val="Textoennegrita"/>
+          <w:rFonts w:ascii="Palatino Linotype" w:hAnsi="Palatino Linotype"/>
+          <w:color w:val="000000"/>
+          <w:sz w:val="22"/>
+          <w:szCs w:val="22"/>
+          <w:lang w:val="en-US"/>
+        </w:rPr>
+        <w:t>formato</w:t>
+      </w:r>
+      <w:proofErr w:type="spellEnd"/>
+      <w:r>
+        <w:rPr>
+          <w:rStyle w:val="Textoennegrita"/>
+          <w:rFonts w:ascii="Palatino Linotype" w:hAnsi="Palatino Linotype"/>
+          <w:color w:val="000000"/>
+          <w:sz w:val="22"/>
+          <w:szCs w:val="22"/>
+          <w:lang w:val="en-US"/>
+        </w:rPr>
+        <w:t xml:space="preserve">, color, </w:t>
+      </w:r>
+      <w:proofErr w:type="spellStart"/>
+      <w:r>
+        <w:rPr>
+          <w:rStyle w:val="Textoennegrita"/>
+          <w:rFonts w:ascii="Palatino Linotype" w:hAnsi="Palatino Linotype"/>
+          <w:color w:val="000000"/>
+          <w:sz w:val="22"/>
+          <w:szCs w:val="22"/>
+          <w:lang w:val="en-US"/>
+        </w:rPr>
+        <w:t>tamaño</w:t>
+      </w:r>
+      <w:proofErr w:type="spellEnd"/>
+      <w:r>
+        <w:rPr>
+          <w:rStyle w:val="Textoennegrita"/>
+          <w:rFonts w:ascii="Palatino Linotype" w:hAnsi="Palatino Linotype"/>
+          <w:color w:val="000000"/>
+          <w:sz w:val="22"/>
+          <w:szCs w:val="22"/>
+          <w:lang w:val="en-US"/>
+        </w:rPr>
+        <w:t xml:space="preserve"> de la </w:t>
+      </w:r>
+      <w:proofErr w:type="spellStart"/>
+      <w:r>
+        <w:rPr>
+          <w:rStyle w:val="Textoennegrita"/>
+          <w:rFonts w:ascii="Palatino Linotype" w:hAnsi="Palatino Linotype"/>
+          <w:color w:val="000000"/>
+          <w:sz w:val="22"/>
+          <w:szCs w:val="22"/>
+          <w:lang w:val="en-US"/>
+        </w:rPr>
+        <w:t>seccion</w:t>
+      </w:r>
+      <w:proofErr w:type="spellEnd"/>
+      <w:r>
+        <w:rPr>
+          <w:rStyle w:val="Textoennegrita"/>
+          <w:rFonts w:ascii="Palatino Linotype" w:hAnsi="Palatino Linotype"/>
+          <w:color w:val="000000"/>
+          <w:sz w:val="22"/>
+          <w:szCs w:val="22"/>
+          <w:lang w:val="en-US"/>
+        </w:rPr>
+        <w:t xml:space="preserve"> Publications.</w:t>
+      </w:r>
+    </w:p>
+    <w:p>
+      <w:pPr>
+        <w:pStyle w:val="Ttulo3"/>
+        <w:spacing w:line="276" w:lineRule="auto"/>
+        <w:rPr>
+          <w:rStyle w:val="Textoennegrita"/>
+          <w:rFonts w:ascii="Palatino Linotype" w:hAnsi="Palatino Linotype"/>
+          <w:color w:val="000000"/>
+          <w:sz w:val="22"/>
+          <w:szCs w:val="22"/>
+          <w:lang w:val="en-US"/>
+        </w:rPr>
+      </w:pPr>
+      <w:proofErr w:type="spellStart"/>
+      <w:r>
+        <w:rPr>
+          <w:rStyle w:val="Textoennegrita"/>
+          <w:rFonts w:ascii="Palatino Linotype" w:hAnsi="Palatino Linotype"/>
+          <w:color w:val="000000"/>
+          <w:sz w:val="22"/>
+          <w:szCs w:val="22"/>
+          <w:lang w:val="en-US"/>
+        </w:rPr>
+        <w:t>En</w:t>
+      </w:r>
+      <w:proofErr w:type="spellEnd"/>
+      <w:r>
+        <w:rPr>
+          <w:rStyle w:val="Textoennegrita"/>
+          <w:rFonts w:ascii="Palatino Linotype" w:hAnsi="Palatino Linotype"/>
+          <w:color w:val="000000"/>
+          <w:sz w:val="22"/>
+          <w:szCs w:val="22"/>
+          <w:lang w:val="en-US"/>
+        </w:rPr>
+        <w:t xml:space="preserve"> la version desktop, </w:t>
+      </w:r>
+      <w:proofErr w:type="spellStart"/>
+      <w:r>
+        <w:rPr>
+          <w:rStyle w:val="Textoennegrita"/>
+          <w:rFonts w:ascii="Palatino Linotype" w:hAnsi="Palatino Linotype"/>
+          <w:color w:val="000000"/>
+          <w:sz w:val="22"/>
+          <w:szCs w:val="22"/>
+          <w:lang w:val="en-US"/>
+        </w:rPr>
+        <w:t>muestra</w:t>
+      </w:r>
+      <w:proofErr w:type="spellEnd"/>
+      <w:r>
+        <w:rPr>
+          <w:rStyle w:val="Textoennegrita"/>
+          <w:rFonts w:ascii="Palatino Linotype" w:hAnsi="Palatino Linotype"/>
+          <w:color w:val="000000"/>
+          <w:sz w:val="22"/>
+          <w:szCs w:val="22"/>
+          <w:lang w:val="en-US"/>
+        </w:rPr>
+        <w:t xml:space="preserve"> 4 </w:t>
+      </w:r>
+      <w:proofErr w:type="spellStart"/>
+      <w:r>
+        <w:rPr>
+          <w:rStyle w:val="Textoennegrita"/>
+          <w:rFonts w:ascii="Palatino Linotype" w:hAnsi="Palatino Linotype"/>
+          <w:color w:val="000000"/>
+          <w:sz w:val="22"/>
+          <w:szCs w:val="22"/>
+          <w:lang w:val="en-US"/>
+        </w:rPr>
+        <w:t>tarjetas</w:t>
+      </w:r>
+      <w:proofErr w:type="spellEnd"/>
+      <w:r>
+        <w:rPr>
+          <w:rStyle w:val="Textoennegrita"/>
+          <w:rFonts w:ascii="Palatino Linotype" w:hAnsi="Palatino Linotype"/>
+          <w:color w:val="000000"/>
+          <w:sz w:val="22"/>
+          <w:szCs w:val="22"/>
+          <w:lang w:val="en-US"/>
+        </w:rPr>
+        <w:t xml:space="preserve"> </w:t>
+      </w:r>
+      <w:proofErr w:type="spellStart"/>
+      <w:r>
+        <w:rPr>
+          <w:rStyle w:val="Textoennegrita"/>
+          <w:rFonts w:ascii="Palatino Linotype" w:hAnsi="Palatino Linotype"/>
+          <w:color w:val="000000"/>
+          <w:sz w:val="22"/>
+          <w:szCs w:val="22"/>
+          <w:lang w:val="en-US"/>
+        </w:rPr>
+        <w:t>alineadas</w:t>
+      </w:r>
+      <w:proofErr w:type="spellEnd"/>
+      <w:r>
+        <w:rPr>
+          <w:rStyle w:val="Textoennegrita"/>
+          <w:rFonts w:ascii="Palatino Linotype" w:hAnsi="Palatino Linotype"/>
+          <w:color w:val="000000"/>
+          <w:sz w:val="22"/>
+          <w:szCs w:val="22"/>
+          <w:lang w:val="en-US"/>
+        </w:rPr>
+        <w:t xml:space="preserve"> </w:t>
+      </w:r>
+      <w:proofErr w:type="spellStart"/>
+      <w:r>
+        <w:rPr>
+          <w:rStyle w:val="Textoennegrita"/>
+          <w:rFonts w:ascii="Palatino Linotype" w:hAnsi="Palatino Linotype"/>
+          <w:color w:val="000000"/>
+          <w:sz w:val="22"/>
+          <w:szCs w:val="22"/>
+          <w:lang w:val="en-US"/>
+        </w:rPr>
+        <w:t>horizontalmente</w:t>
+      </w:r>
+      <w:proofErr w:type="spellEnd"/>
+      <w:r>
+        <w:rPr>
+          <w:rStyle w:val="Textoennegrita"/>
+          <w:rFonts w:ascii="Palatino Linotype" w:hAnsi="Palatino Linotype"/>
+          <w:color w:val="000000"/>
+          <w:sz w:val="22"/>
+          <w:szCs w:val="22"/>
+          <w:lang w:val="en-US"/>
+        </w:rPr>
+        <w:t xml:space="preserve">, y </w:t>
+      </w:r>
+      <w:proofErr w:type="spellStart"/>
+      <w:r>
+        <w:rPr>
+          <w:rStyle w:val="Textoennegrita"/>
+          <w:rFonts w:ascii="Palatino Linotype" w:hAnsi="Palatino Linotype"/>
+          <w:color w:val="000000"/>
+          <w:sz w:val="22"/>
+          <w:szCs w:val="22"/>
+          <w:lang w:val="en-US"/>
+        </w:rPr>
+        <w:t>dejajo</w:t>
+      </w:r>
+      <w:proofErr w:type="spellEnd"/>
+      <w:r>
+        <w:rPr>
+          <w:rStyle w:val="Textoennegrita"/>
+          <w:rFonts w:ascii="Palatino Linotype" w:hAnsi="Palatino Linotype"/>
+          <w:color w:val="000000"/>
+          <w:sz w:val="22"/>
+          <w:szCs w:val="22"/>
+          <w:lang w:val="en-US"/>
+        </w:rPr>
+        <w:t xml:space="preserve"> </w:t>
+      </w:r>
+      <w:proofErr w:type="spellStart"/>
+      <w:r>
+        <w:rPr>
+          <w:rStyle w:val="Textoennegrita"/>
+          <w:rFonts w:ascii="Palatino Linotype" w:hAnsi="Palatino Linotype"/>
+          <w:color w:val="000000"/>
+          <w:sz w:val="22"/>
+          <w:szCs w:val="22"/>
+          <w:lang w:val="en-US"/>
+        </w:rPr>
+        <w:t>otras</w:t>
+      </w:r>
+      <w:proofErr w:type="spellEnd"/>
+      <w:r>
+        <w:rPr>
+          <w:rStyle w:val="Textoennegrita"/>
+          <w:rFonts w:ascii="Palatino Linotype" w:hAnsi="Palatino Linotype"/>
+          <w:color w:val="000000"/>
+          <w:sz w:val="22"/>
+          <w:szCs w:val="22"/>
+          <w:lang w:val="en-US"/>
+        </w:rPr>
+        <w:t xml:space="preserve"> 4 mas, hasta </w:t>
+      </w:r>
+      <w:proofErr w:type="spellStart"/>
+      <w:r>
+        <w:rPr>
+          <w:rStyle w:val="Textoennegrita"/>
+          <w:rFonts w:ascii="Palatino Linotype" w:hAnsi="Palatino Linotype"/>
+          <w:color w:val="000000"/>
+          <w:sz w:val="22"/>
+          <w:szCs w:val="22"/>
+          <w:lang w:val="en-US"/>
+        </w:rPr>
+        <w:t>completarlas</w:t>
+      </w:r>
+      <w:proofErr w:type="spellEnd"/>
+      <w:r>
+        <w:rPr>
+          <w:rStyle w:val="Textoennegrita"/>
+          <w:rFonts w:ascii="Palatino Linotype" w:hAnsi="Palatino Linotype"/>
+          <w:color w:val="000000"/>
+          <w:sz w:val="22"/>
+          <w:szCs w:val="22"/>
+          <w:lang w:val="en-US"/>
+        </w:rPr>
+        <w:t xml:space="preserve"> </w:t>
+      </w:r>
+      <w:proofErr w:type="spellStart"/>
+      <w:r>
+        <w:rPr>
+          <w:rStyle w:val="Textoennegrita"/>
+          <w:rFonts w:ascii="Palatino Linotype" w:hAnsi="Palatino Linotype"/>
+          <w:color w:val="000000"/>
+          <w:sz w:val="22"/>
+          <w:szCs w:val="22"/>
+          <w:lang w:val="en-US"/>
+        </w:rPr>
+        <w:t>todas</w:t>
+      </w:r>
+      <w:proofErr w:type="spellEnd"/>
+      <w:r>
+        <w:rPr>
+          <w:rStyle w:val="Textoennegrita"/>
+          <w:rFonts w:ascii="Palatino Linotype" w:hAnsi="Palatino Linotype"/>
+          <w:color w:val="000000"/>
+          <w:sz w:val="22"/>
+          <w:szCs w:val="22"/>
+          <w:lang w:val="en-US"/>
+        </w:rPr>
+        <w:t>.</w:t>
+      </w:r>
+    </w:p>
+    <w:p>
+      <w:pPr>
+        <w:rPr>
+          <w:lang w:val="en-US"/>
+        </w:rPr>
+      </w:pPr>
+    </w:p>
+    <w:p>
+      <w:pPr>
+        <w:rPr>
+          <w:lang w:val="en-US"/>
+        </w:rPr>
+      </w:pPr>
+      <w:proofErr w:type="spellStart"/>
+      <w:r>
+        <w:rPr>
+          <w:lang w:val="en-US"/>
+        </w:rPr>
+        <w:t>Ejemplo</w:t>
+      </w:r>
+      <w:proofErr w:type="spellEnd"/>
+      <w:r>
+        <w:rPr>
+          <w:lang w:val="en-US"/>
+        </w:rPr>
+        <w:t xml:space="preserve"> de </w:t>
+      </w:r>
+      <w:proofErr w:type="spellStart"/>
+      <w:r>
+        <w:rPr>
+          <w:lang w:val="en-US"/>
+        </w:rPr>
+        <w:t>tarjetas</w:t>
+      </w:r>
+      <w:proofErr w:type="spellEnd"/>
+      <w:r>
+        <w:rPr>
+          <w:lang w:val="en-US"/>
+        </w:rPr>
+        <w:t xml:space="preserve"> </w:t>
+      </w:r>
+      <w:proofErr w:type="spellStart"/>
+      <w:r>
+        <w:rPr>
+          <w:lang w:val="en-US"/>
+        </w:rPr>
+        <w:t>en</w:t>
+      </w:r>
+      <w:proofErr w:type="spellEnd"/>
+      <w:r>
+        <w:rPr>
+          <w:lang w:val="en-US"/>
+        </w:rPr>
+        <w:t xml:space="preserve"> Grants (se debe </w:t>
+      </w:r>
+      <w:proofErr w:type="spellStart"/>
+      <w:r>
+        <w:rPr>
+          <w:lang w:val="en-US"/>
+        </w:rPr>
+        <w:t>mostrar</w:t>
+      </w:r>
+      <w:proofErr w:type="spellEnd"/>
+      <w:r>
+        <w:rPr>
+          <w:lang w:val="en-US"/>
+        </w:rPr>
+        <w:t xml:space="preserve"> de forma </w:t>
+      </w:r>
+      <w:proofErr w:type="spellStart"/>
+      <w:r>
+        <w:rPr>
+          <w:lang w:val="en-US"/>
+        </w:rPr>
+        <w:t>cronologica</w:t>
+      </w:r>
+      <w:proofErr w:type="spellEnd"/>
+      <w:r>
+        <w:rPr>
+          <w:lang w:val="en-US"/>
+        </w:rPr>
+        <w:t xml:space="preserve">, la </w:t>
+      </w:r>
+      <w:proofErr w:type="spellStart"/>
+      <w:r>
+        <w:rPr>
+          <w:lang w:val="en-US"/>
+        </w:rPr>
+        <w:t>primera</w:t>
+      </w:r>
+      <w:proofErr w:type="spellEnd"/>
+      <w:r>
+        <w:rPr>
+          <w:lang w:val="en-US"/>
+        </w:rPr>
+        <w:t xml:space="preserve"> es </w:t>
+      </w:r>
+      <w:proofErr w:type="spellStart"/>
+      <w:r>
+        <w:rPr>
+          <w:lang w:val="en-US"/>
+        </w:rPr>
+        <w:t>el</w:t>
+      </w:r>
+      <w:proofErr w:type="spellEnd"/>
+      <w:r>
+        <w:rPr>
+          <w:lang w:val="en-US"/>
+        </w:rPr>
+        <w:t xml:space="preserve"> </w:t>
+      </w:r>
+      <w:proofErr w:type="spellStart"/>
+      <w:r>
+        <w:rPr>
+          <w:lang w:val="en-US"/>
+        </w:rPr>
+        <w:t>año</w:t>
+      </w:r>
+      <w:proofErr w:type="spellEnd"/>
+      <w:r>
+        <w:rPr>
+          <w:lang w:val="en-US"/>
+        </w:rPr>
+        <w:t xml:space="preserve"> mas </w:t>
+      </w:r>
+      <w:proofErr w:type="spellStart"/>
+      <w:r>
+        <w:rPr>
+          <w:lang w:val="en-US"/>
+        </w:rPr>
+        <w:t>reciente</w:t>
+      </w:r>
+      <w:proofErr w:type="spellEnd"/>
+      <w:r>
+        <w:rPr>
+          <w:lang w:val="en-US"/>
+        </w:rPr>
+        <w:t>.</w:t>
+      </w:r>
+    </w:p>
+    <w:p>
+      <w:pPr>
+        <w:rPr>
+          <w:lang w:val="en-US"/>
+        </w:rPr>
+      </w:pPr>
+    </w:p>
+    <w:p>
+      <w:pPr>
+        <w:rPr>
+          <w:rStyle w:val="nfasis"/>
+          <w:rFonts w:ascii="Palatino Linotype" w:eastAsiaTheme="majorEastAsia" w:hAnsi="Palatino Linotype"/>
+          <w:color w:val="000000"/>
+          <w:sz w:val="22"/>
+          <w:szCs w:val="22"/>
+          <w:lang w:val="en-US"/>
+        </w:rPr>
+      </w:pPr>
+      <w:proofErr w:type="spellStart"/>
+      <w:r>
+        <w:rPr>
+          <w:lang w:val="en-US"/>
+        </w:rPr>
+        <w:t>Titulo</w:t>
+      </w:r>
+      <w:proofErr w:type="spellEnd"/>
+      <w:r>
+        <w:rPr>
+          <w:lang w:val="en-US"/>
+        </w:rPr>
+        <w:t xml:space="preserve"> color </w:t>
+      </w:r>
+      <w:proofErr w:type="gramStart"/>
+      <w:r>
+        <w:rPr>
+          <w:lang w:val="en-US"/>
+        </w:rPr>
+        <w:t xml:space="preserve">negro </w:t>
+      </w:r>
+      <w:r>
+        <w:rPr>
+          <w:lang w:val="en-US"/>
+        </w:rPr>
+        <w:t>:</w:t>
+      </w:r>
+      <w:proofErr w:type="gramEnd"/>
+      <w:r>
+        <w:rPr>
+          <w:lang w:val="en-US"/>
+        </w:rPr>
+        <w:t xml:space="preserve"> </w:t>
+      </w:r>
+      <w:r>
+        <w:rPr>
+          <w:rStyle w:val="nfasis"/>
+          <w:rFonts w:ascii="Palatino Linotype" w:eastAsiaTheme="majorEastAsia" w:hAnsi="Palatino Linotype"/>
+          <w:i w:val="0"/>
+          <w:iCs w:val="0"/>
+          <w:color w:val="000000"/>
+          <w:sz w:val="22"/>
+          <w:szCs w:val="22"/>
+          <w:lang w:val="en-US"/>
+        </w:rPr>
+        <w:t>Reproductive effects of air pollution produced by residential wood combustion exposure in south-central Chile, with emphasis on placenta, umbilical cord, ovary, and endometrium: An experimental study in rats.</w:t>
+      </w:r>
+    </w:p>
+    <w:p>
+      <w:pPr>
+        <w:rPr>
+          <w:rStyle w:val="Textoennegrita"/>
+          <w:rFonts w:ascii="Palatino Linotype" w:eastAsiaTheme="majorEastAsia" w:hAnsi="Palatino Linotype" w:cstheme="majorBidi"/>
+          <w:b w:val="0"/>
+          <w:bCs w:val="0"/>
+          <w:color w:val="000000"/>
+          <w:sz w:val="22"/>
+          <w:szCs w:val="22"/>
+          <w:lang w:val="en-US"/>
+        </w:rPr>
+      </w:pPr>
+      <w:proofErr w:type="spellStart"/>
+      <w:r>
+        <w:rPr>
+          <w:rStyle w:val="nfasis"/>
+          <w:rFonts w:ascii="Palatino Linotype" w:eastAsiaTheme="majorEastAsia" w:hAnsi="Palatino Linotype"/>
+          <w:i w:val="0"/>
+          <w:iCs w:val="0"/>
+          <w:color w:val="000000"/>
+          <w:sz w:val="22"/>
+          <w:szCs w:val="22"/>
+          <w:lang w:val="en-US"/>
+        </w:rPr>
+        <w:t>Debajo</w:t>
+      </w:r>
+      <w:proofErr w:type="spellEnd"/>
+      <w:r>
+        <w:rPr>
+          <w:rStyle w:val="Textoennegrita"/>
+          <w:rFonts w:cstheme="majorBidi"/>
+        </w:rPr>
+        <w:t xml:space="preserve">: </w:t>
+      </w:r>
+      <w:proofErr w:type="spellStart"/>
+      <w:r>
+        <w:rPr>
+          <w:rStyle w:val="Textoennegrita"/>
+          <w:rFonts w:ascii="Palatino Linotype" w:eastAsiaTheme="majorEastAsia" w:hAnsi="Palatino Linotype" w:cstheme="majorBidi"/>
+          <w:b w:val="0"/>
+          <w:bCs w:val="0"/>
+          <w:color w:val="000000"/>
+          <w:sz w:val="22"/>
+          <w:szCs w:val="22"/>
+          <w:lang w:val="en-US"/>
+        </w:rPr>
+        <w:t>Fondecyt</w:t>
+      </w:r>
+      <w:proofErr w:type="spellEnd"/>
+      <w:r>
+        <w:rPr>
+          <w:rStyle w:val="Textoennegrita"/>
+          <w:rFonts w:ascii="Palatino Linotype" w:eastAsiaTheme="majorEastAsia" w:hAnsi="Palatino Linotype" w:cstheme="majorBidi"/>
+          <w:b w:val="0"/>
+          <w:bCs w:val="0"/>
+          <w:color w:val="000000"/>
+          <w:sz w:val="22"/>
+          <w:szCs w:val="22"/>
+          <w:lang w:val="en-US"/>
+        </w:rPr>
+        <w:t xml:space="preserve"> </w:t>
+      </w:r>
+      <w:proofErr w:type="spellStart"/>
+      <w:r>
+        <w:rPr>
+          <w:rStyle w:val="Textoennegrita"/>
+          <w:rFonts w:ascii="Palatino Linotype" w:eastAsiaTheme="majorEastAsia" w:hAnsi="Palatino Linotype" w:cstheme="majorBidi"/>
+          <w:b w:val="0"/>
+          <w:bCs w:val="0"/>
+          <w:color w:val="000000"/>
+          <w:sz w:val="22"/>
+          <w:szCs w:val="22"/>
+          <w:lang w:val="en-US"/>
+        </w:rPr>
+        <w:t>Initiation</w:t>
+      </w:r>
+      <w:proofErr w:type="spellEnd"/>
+      <w:r>
+        <w:rPr>
+          <w:rStyle w:val="Textoennegrita"/>
+          <w:rFonts w:ascii="Palatino Linotype" w:eastAsiaTheme="majorEastAsia" w:hAnsi="Palatino Linotype" w:cstheme="majorBidi"/>
+          <w:b w:val="0"/>
+          <w:bCs w:val="0"/>
+          <w:color w:val="000000"/>
+          <w:sz w:val="22"/>
+          <w:szCs w:val="22"/>
+          <w:lang w:val="en-US"/>
+        </w:rPr>
+        <w:t xml:space="preserve"> 2020 (No. 11200775)</w:t>
+      </w:r>
+      <w:r>
+        <w:rPr>
+          <w:rStyle w:val="Textoennegrita"/>
+          <w:rFonts w:ascii="Palatino Linotype" w:eastAsiaTheme="majorEastAsia" w:hAnsi="Palatino Linotype" w:cstheme="majorBidi"/>
+          <w:b w:val="0"/>
+          <w:bCs w:val="0"/>
+          <w:color w:val="000000"/>
+          <w:sz w:val="22"/>
+          <w:szCs w:val="22"/>
+          <w:lang w:val="en-US"/>
+        </w:rPr>
+        <w:t xml:space="preserve">, </w:t>
+      </w:r>
+    </w:p>
+    <w:p>
+      <w:pPr>
+        <w:rPr>
+          <w:rStyle w:val="Textoennegrita"/>
+          <w:rFonts w:ascii="Palatino Linotype" w:eastAsiaTheme="majorEastAsia" w:hAnsi="Palatino Linotype" w:cstheme="majorBidi"/>
+          <w:b w:val="0"/>
+          <w:bCs w:val="0"/>
+          <w:color w:val="000000"/>
+          <w:sz w:val="22"/>
+          <w:szCs w:val="22"/>
+          <w:lang w:val="en-US"/>
+        </w:rPr>
+      </w:pPr>
+      <w:r>
+        <w:rPr>
+          <w:rStyle w:val="Textoennegrita"/>
+          <w:rFonts w:ascii="Palatino Linotype" w:eastAsiaTheme="majorEastAsia" w:hAnsi="Palatino Linotype" w:cstheme="majorBidi"/>
+          <w:b w:val="0"/>
+          <w:bCs w:val="0"/>
+          <w:color w:val="000000"/>
+          <w:sz w:val="22"/>
+          <w:szCs w:val="22"/>
+          <w:lang w:val="en-US"/>
+        </w:rPr>
+        <w:t xml:space="preserve">Y </w:t>
+      </w:r>
+      <w:proofErr w:type="spellStart"/>
+      <w:r>
+        <w:rPr>
+          <w:rStyle w:val="Textoennegrita"/>
+          <w:rFonts w:ascii="Palatino Linotype" w:eastAsiaTheme="majorEastAsia" w:hAnsi="Palatino Linotype" w:cstheme="majorBidi"/>
+          <w:b w:val="0"/>
+          <w:bCs w:val="0"/>
+          <w:color w:val="000000"/>
+          <w:sz w:val="22"/>
+          <w:szCs w:val="22"/>
+          <w:lang w:val="en-US"/>
+        </w:rPr>
+        <w:t>abajo</w:t>
+      </w:r>
+      <w:proofErr w:type="spellEnd"/>
+      <w:r>
+        <w:rPr>
+          <w:rStyle w:val="Textoennegrita"/>
+          <w:rFonts w:ascii="Palatino Linotype" w:eastAsiaTheme="majorEastAsia" w:hAnsi="Palatino Linotype" w:cstheme="majorBidi"/>
+          <w:b w:val="0"/>
+          <w:bCs w:val="0"/>
+          <w:color w:val="000000"/>
+          <w:sz w:val="22"/>
+          <w:szCs w:val="22"/>
+          <w:lang w:val="en-US"/>
+        </w:rPr>
+        <w:t xml:space="preserve"> a la </w:t>
+      </w:r>
+      <w:proofErr w:type="spellStart"/>
+      <w:r>
+        <w:rPr>
+          <w:rStyle w:val="Textoennegrita"/>
+          <w:rFonts w:ascii="Palatino Linotype" w:eastAsiaTheme="majorEastAsia" w:hAnsi="Palatino Linotype" w:cstheme="majorBidi"/>
+          <w:b w:val="0"/>
+          <w:bCs w:val="0"/>
+          <w:color w:val="000000"/>
+          <w:sz w:val="22"/>
+          <w:szCs w:val="22"/>
+          <w:lang w:val="en-US"/>
+        </w:rPr>
+        <w:t>izquierda</w:t>
+      </w:r>
+      <w:proofErr w:type="spellEnd"/>
+      <w:r>
+        <w:rPr>
+          <w:rStyle w:val="Textoennegrita"/>
+          <w:rFonts w:ascii="Palatino Linotype" w:eastAsiaTheme="majorEastAsia" w:hAnsi="Palatino Linotype" w:cstheme="majorBidi"/>
+          <w:b w:val="0"/>
+          <w:bCs w:val="0"/>
+          <w:color w:val="000000"/>
+          <w:sz w:val="22"/>
+          <w:szCs w:val="22"/>
+          <w:lang w:val="en-US"/>
+        </w:rPr>
+        <w:t xml:space="preserve">: </w:t>
+      </w:r>
+      <w:proofErr w:type="spellStart"/>
+      <w:r>
+        <w:rPr>
+          <w:rStyle w:val="Textoennegrita"/>
+          <w:rFonts w:ascii="Palatino Linotype" w:eastAsiaTheme="majorEastAsia" w:hAnsi="Palatino Linotype" w:cstheme="majorBidi"/>
+          <w:b w:val="0"/>
+          <w:bCs w:val="0"/>
+          <w:color w:val="000000"/>
+          <w:sz w:val="22"/>
+          <w:szCs w:val="22"/>
+          <w:lang w:val="en-US"/>
+        </w:rPr>
+        <w:t>Fondecyt</w:t>
+      </w:r>
+      <w:proofErr w:type="spellEnd"/>
+      <w:r>
+        <w:rPr>
+          <w:rStyle w:val="Textoennegrita"/>
+          <w:rFonts w:ascii="Palatino Linotype" w:eastAsiaTheme="majorEastAsia" w:hAnsi="Palatino Linotype" w:cstheme="majorBidi"/>
+          <w:b w:val="0"/>
+          <w:bCs w:val="0"/>
+          <w:color w:val="000000"/>
+          <w:sz w:val="22"/>
+          <w:szCs w:val="22"/>
+          <w:lang w:val="en-US"/>
+        </w:rPr>
+        <w:t xml:space="preserve"> y al </w:t>
+      </w:r>
+      <w:proofErr w:type="spellStart"/>
+      <w:r>
+        <w:rPr>
+          <w:rStyle w:val="Textoennegrita"/>
+          <w:rFonts w:ascii="Palatino Linotype" w:eastAsiaTheme="majorEastAsia" w:hAnsi="Palatino Linotype" w:cstheme="majorBidi"/>
+          <w:b w:val="0"/>
+          <w:bCs w:val="0"/>
+          <w:color w:val="000000"/>
+          <w:sz w:val="22"/>
+          <w:szCs w:val="22"/>
+          <w:lang w:val="en-US"/>
+        </w:rPr>
+        <w:t>lado</w:t>
+      </w:r>
+      <w:proofErr w:type="spellEnd"/>
+      <w:r>
+        <w:rPr>
+          <w:rStyle w:val="Textoennegrita"/>
+          <w:rFonts w:ascii="Palatino Linotype" w:eastAsiaTheme="majorEastAsia" w:hAnsi="Palatino Linotype" w:cstheme="majorBidi"/>
+          <w:b w:val="0"/>
+          <w:bCs w:val="0"/>
+          <w:color w:val="000000"/>
+          <w:sz w:val="22"/>
+          <w:szCs w:val="22"/>
+          <w:lang w:val="en-US"/>
+        </w:rPr>
+        <w:t xml:space="preserve"> derecho 2020</w:t>
+      </w:r>
+    </w:p>
+    <w:p>
+      <w:pPr>
+        <w:rPr>
+          <w:rStyle w:val="Textoennegrita"/>
+          <w:rFonts w:ascii="Palatino Linotype" w:eastAsiaTheme="majorEastAsia" w:hAnsi="Palatino Linotype" w:cstheme="majorBidi"/>
+          <w:b w:val="0"/>
+          <w:bCs w:val="0"/>
+          <w:color w:val="000000"/>
+          <w:sz w:val="22"/>
+          <w:szCs w:val="22"/>
+          <w:lang w:val="en-US"/>
+        </w:rPr>
+      </w:pPr>
+    </w:p>
+    <w:p>
+      <w:pPr>
+        <w:rPr>
+          <w:rStyle w:val="Textoennegrita"/>
+          <w:rFonts w:ascii="Palatino Linotype" w:eastAsiaTheme="majorEastAsia" w:hAnsi="Palatino Linotype" w:cstheme="majorBidi"/>
+          <w:b w:val="0"/>
+          <w:bCs w:val="0"/>
+          <w:color w:val="000000"/>
+          <w:sz w:val="22"/>
+          <w:szCs w:val="22"/>
+          <w:lang w:val="en-US"/>
+        </w:rPr>
+      </w:pPr>
+      <w:r>
+        <w:rPr>
+          <w:rStyle w:val="Textoennegrita"/>
+          <w:rFonts w:ascii="Palatino Linotype" w:eastAsiaTheme="majorEastAsia" w:hAnsi="Palatino Linotype" w:cstheme="majorBidi"/>
+          <w:b w:val="0"/>
+          <w:bCs w:val="0"/>
+          <w:color w:val="000000"/>
+          <w:sz w:val="22"/>
+          <w:szCs w:val="22"/>
+          <w:lang w:val="en-US"/>
+        </w:rPr>
+        <w:t xml:space="preserve">Toda la </w:t>
+      </w:r>
+      <w:proofErr w:type="spellStart"/>
+      <w:r>
+        <w:rPr>
+          <w:rStyle w:val="Textoennegrita"/>
+          <w:rFonts w:ascii="Palatino Linotype" w:eastAsiaTheme="majorEastAsia" w:hAnsi="Palatino Linotype" w:cstheme="majorBidi"/>
+          <w:b w:val="0"/>
+          <w:bCs w:val="0"/>
+          <w:color w:val="000000"/>
+          <w:sz w:val="22"/>
+          <w:szCs w:val="22"/>
+          <w:lang w:val="en-US"/>
+        </w:rPr>
+        <w:t>pagina</w:t>
+      </w:r>
+      <w:proofErr w:type="spellEnd"/>
+      <w:r>
+        <w:rPr>
+          <w:rStyle w:val="Textoennegrita"/>
+          <w:rFonts w:ascii="Palatino Linotype" w:eastAsiaTheme="majorEastAsia" w:hAnsi="Palatino Linotype" w:cstheme="majorBidi"/>
+          <w:b w:val="0"/>
+          <w:bCs w:val="0"/>
+          <w:color w:val="000000"/>
+          <w:sz w:val="22"/>
+          <w:szCs w:val="22"/>
+          <w:lang w:val="en-US"/>
+        </w:rPr>
+        <w:t xml:space="preserve"> </w:t>
+      </w:r>
+      <w:proofErr w:type="spellStart"/>
+      <w:r>
+        <w:rPr>
+          <w:rStyle w:val="Textoennegrita"/>
+          <w:rFonts w:ascii="Palatino Linotype" w:eastAsiaTheme="majorEastAsia" w:hAnsi="Palatino Linotype" w:cstheme="majorBidi"/>
+          <w:b w:val="0"/>
+          <w:bCs w:val="0"/>
+          <w:color w:val="000000"/>
+          <w:sz w:val="22"/>
+          <w:szCs w:val="22"/>
+          <w:lang w:val="en-US"/>
+        </w:rPr>
+        <w:t>usa</w:t>
+      </w:r>
+      <w:proofErr w:type="spellEnd"/>
+      <w:r>
+        <w:rPr>
+          <w:rStyle w:val="Textoennegrita"/>
+          <w:rFonts w:ascii="Palatino Linotype" w:eastAsiaTheme="majorEastAsia" w:hAnsi="Palatino Linotype" w:cstheme="majorBidi"/>
+          <w:b w:val="0"/>
+          <w:bCs w:val="0"/>
+          <w:color w:val="000000"/>
+          <w:sz w:val="22"/>
+          <w:szCs w:val="22"/>
+          <w:lang w:val="en-US"/>
+        </w:rPr>
+        <w:t xml:space="preserve"> </w:t>
+      </w:r>
+      <w:proofErr w:type="spellStart"/>
+      <w:r>
+        <w:rPr>
+          <w:rStyle w:val="Textoennegrita"/>
+          <w:rFonts w:ascii="Palatino Linotype" w:eastAsiaTheme="majorEastAsia" w:hAnsi="Palatino Linotype" w:cstheme="majorBidi"/>
+          <w:b w:val="0"/>
+          <w:bCs w:val="0"/>
+          <w:color w:val="000000"/>
+          <w:sz w:val="22"/>
+          <w:szCs w:val="22"/>
+          <w:lang w:val="en-US"/>
+        </w:rPr>
+        <w:t>el</w:t>
+      </w:r>
+      <w:proofErr w:type="spellEnd"/>
+      <w:r>
+        <w:rPr>
+          <w:rStyle w:val="Textoennegrita"/>
+          <w:rFonts w:ascii="Palatino Linotype" w:eastAsiaTheme="majorEastAsia" w:hAnsi="Palatino Linotype" w:cstheme="majorBidi"/>
+          <w:b w:val="0"/>
+          <w:bCs w:val="0"/>
+          <w:color w:val="000000"/>
+          <w:sz w:val="22"/>
+          <w:szCs w:val="22"/>
+          <w:lang w:val="en-US"/>
+        </w:rPr>
+        <w:t xml:space="preserve"> </w:t>
+      </w:r>
+      <w:proofErr w:type="spellStart"/>
+      <w:r>
+        <w:rPr>
+          <w:rStyle w:val="Textoennegrita"/>
+          <w:rFonts w:ascii="Palatino Linotype" w:eastAsiaTheme="majorEastAsia" w:hAnsi="Palatino Linotype" w:cstheme="majorBidi"/>
+          <w:b w:val="0"/>
+          <w:bCs w:val="0"/>
+          <w:color w:val="000000"/>
+          <w:sz w:val="22"/>
+          <w:szCs w:val="22"/>
+          <w:lang w:val="en-US"/>
+        </w:rPr>
+        <w:t>mimso</w:t>
+      </w:r>
+      <w:proofErr w:type="spellEnd"/>
+      <w:r>
+        <w:rPr>
+          <w:rStyle w:val="Textoennegrita"/>
+          <w:rFonts w:ascii="Palatino Linotype" w:eastAsiaTheme="majorEastAsia" w:hAnsi="Palatino Linotype" w:cstheme="majorBidi"/>
+          <w:b w:val="0"/>
+          <w:bCs w:val="0"/>
+          <w:color w:val="000000"/>
+          <w:sz w:val="22"/>
+          <w:szCs w:val="22"/>
+          <w:lang w:val="en-US"/>
+        </w:rPr>
+        <w:t xml:space="preserve"> </w:t>
+      </w:r>
+      <w:proofErr w:type="spellStart"/>
+      <w:r>
+        <w:rPr>
+          <w:rStyle w:val="Textoennegrita"/>
+          <w:rFonts w:ascii="Palatino Linotype" w:eastAsiaTheme="majorEastAsia" w:hAnsi="Palatino Linotype" w:cstheme="majorBidi"/>
+          <w:b w:val="0"/>
+          <w:bCs w:val="0"/>
+          <w:color w:val="000000"/>
+          <w:sz w:val="22"/>
+          <w:szCs w:val="22"/>
+          <w:lang w:val="en-US"/>
+        </w:rPr>
+        <w:t>tipo</w:t>
+      </w:r>
+      <w:proofErr w:type="spellEnd"/>
+      <w:r>
+        <w:rPr>
+          <w:rStyle w:val="Textoennegrita"/>
+          <w:rFonts w:ascii="Palatino Linotype" w:eastAsiaTheme="majorEastAsia" w:hAnsi="Palatino Linotype" w:cstheme="majorBidi"/>
+          <w:b w:val="0"/>
+          <w:bCs w:val="0"/>
+          <w:color w:val="000000"/>
+          <w:sz w:val="22"/>
+          <w:szCs w:val="22"/>
+          <w:lang w:val="en-US"/>
+        </w:rPr>
+        <w:t xml:space="preserve"> de </w:t>
+      </w:r>
+      <w:proofErr w:type="spellStart"/>
+      <w:r>
+        <w:rPr>
+          <w:rStyle w:val="Textoennegrita"/>
+          <w:rFonts w:ascii="Palatino Linotype" w:eastAsiaTheme="majorEastAsia" w:hAnsi="Palatino Linotype" w:cstheme="majorBidi"/>
+          <w:b w:val="0"/>
+          <w:bCs w:val="0"/>
+          <w:color w:val="000000"/>
+          <w:sz w:val="22"/>
+          <w:szCs w:val="22"/>
+          <w:lang w:val="en-US"/>
+        </w:rPr>
+        <w:t>letra</w:t>
+      </w:r>
+      <w:proofErr w:type="spellEnd"/>
+      <w:r>
+        <w:rPr>
+          <w:rStyle w:val="Textoennegrita"/>
+          <w:rFonts w:ascii="Palatino Linotype" w:eastAsiaTheme="majorEastAsia" w:hAnsi="Palatino Linotype" w:cstheme="majorBidi"/>
+          <w:b w:val="0"/>
+          <w:bCs w:val="0"/>
+          <w:color w:val="000000"/>
+          <w:sz w:val="22"/>
+          <w:szCs w:val="22"/>
+          <w:lang w:val="en-US"/>
+        </w:rPr>
+        <w:t>: Inter Sans Serif</w:t>
+      </w:r>
+    </w:p>
+    <w:p>
+      <w:pPr>
+        <w:rPr>
+          <w:rStyle w:val="Textoennegrita"/>
+          <w:rFonts w:ascii="Palatino Linotype" w:eastAsiaTheme="majorEastAsia" w:hAnsi="Palatino Linotype" w:cstheme="majorBidi"/>
+          <w:b w:val="0"/>
+          <w:bCs w:val="0"/>
+          <w:color w:val="000000"/>
+          <w:sz w:val="22"/>
+          <w:szCs w:val="22"/>
+          <w:lang w:val="en-US"/>
+        </w:rPr>
+      </w:pPr>
+    </w:p>
+    <w:p>
+      <w:pPr>
+        <w:rPr>
+          <w:rStyle w:val="Textoennegrita"/>
+          <w:rFonts w:ascii="Palatino Linotype" w:eastAsiaTheme="majorEastAsia" w:hAnsi="Palatino Linotype" w:cstheme="majorBidi"/>
+          <w:b w:val="0"/>
+          <w:bCs w:val="0"/>
+          <w:color w:val="000000"/>
+          <w:sz w:val="22"/>
+          <w:szCs w:val="22"/>
+          <w:lang w:val="en-US"/>
+        </w:rPr>
+      </w:pPr>
+      <w:r>
+        <w:rPr>
+          <w:rStyle w:val="Textoennegrita"/>
+          <w:rFonts w:ascii="Palatino Linotype" w:eastAsiaTheme="majorEastAsia" w:hAnsi="Palatino Linotype" w:cstheme="majorBidi"/>
+          <w:b w:val="0"/>
+          <w:bCs w:val="0"/>
+          <w:color w:val="000000"/>
+          <w:sz w:val="22"/>
+          <w:szCs w:val="22"/>
+          <w:lang w:val="en-US"/>
+        </w:rPr>
+        <w:t xml:space="preserve">About-title </w:t>
+      </w:r>
+      <w:proofErr w:type="gramStart"/>
+      <w:r>
+        <w:rPr>
+          <w:rStyle w:val="Textoennegrita"/>
+          <w:rFonts w:ascii="Palatino Linotype" w:eastAsiaTheme="majorEastAsia" w:hAnsi="Palatino Linotype" w:cstheme="majorBidi"/>
+          <w:b w:val="0"/>
+          <w:bCs w:val="0"/>
+          <w:color w:val="000000"/>
+          <w:sz w:val="22"/>
+          <w:szCs w:val="22"/>
+          <w:lang w:val="en-US"/>
+        </w:rPr>
+        <w:t>Publications</w:t>
+      </w:r>
+      <w:proofErr w:type="gramEnd"/>
+      <w:r>
+        <w:rPr>
+          <w:rStyle w:val="Textoennegrita"/>
+          <w:rFonts w:ascii="Palatino Linotype" w:eastAsiaTheme="majorEastAsia" w:hAnsi="Palatino Linotype" w:cstheme="majorBidi"/>
+          <w:b w:val="0"/>
+          <w:bCs w:val="0"/>
+          <w:color w:val="000000"/>
+          <w:sz w:val="22"/>
+          <w:szCs w:val="22"/>
+          <w:lang w:val="en-US"/>
+        </w:rPr>
+        <w:t xml:space="preserve"> font size 2.0 Rem al </w:t>
+      </w:r>
+      <w:proofErr w:type="spellStart"/>
+      <w:r>
+        <w:rPr>
+          <w:rStyle w:val="Textoennegrita"/>
+          <w:rFonts w:ascii="Palatino Linotype" w:eastAsiaTheme="majorEastAsia" w:hAnsi="Palatino Linotype" w:cstheme="majorBidi"/>
+          <w:b w:val="0"/>
+          <w:bCs w:val="0"/>
+          <w:color w:val="000000"/>
+          <w:sz w:val="22"/>
+          <w:szCs w:val="22"/>
+          <w:lang w:val="en-US"/>
+        </w:rPr>
+        <w:t>igual</w:t>
+      </w:r>
+      <w:proofErr w:type="spellEnd"/>
+      <w:r>
+        <w:rPr>
+          <w:rStyle w:val="Textoennegrita"/>
+          <w:rFonts w:ascii="Palatino Linotype" w:eastAsiaTheme="majorEastAsia" w:hAnsi="Palatino Linotype" w:cstheme="majorBidi"/>
+          <w:b w:val="0"/>
+          <w:bCs w:val="0"/>
+          <w:color w:val="000000"/>
+          <w:sz w:val="22"/>
+          <w:szCs w:val="22"/>
+          <w:lang w:val="en-US"/>
+        </w:rPr>
+        <w:t xml:space="preserve"> que Grants y Contact</w:t>
+      </w:r>
+    </w:p>
+    <w:p>
+      <w:pPr>
+        <w:rPr>
+          <w:rStyle w:val="Textoennegrita"/>
+          <w:rFonts w:ascii="Palatino Linotype" w:eastAsiaTheme="majorEastAsia" w:hAnsi="Palatino Linotype" w:cstheme="majorBidi"/>
+          <w:b w:val="0"/>
+          <w:bCs w:val="0"/>
+          <w:color w:val="000000"/>
+          <w:sz w:val="22"/>
+          <w:szCs w:val="22"/>
+          <w:lang w:val="en-US"/>
+        </w:rPr>
+      </w:pPr>
+    </w:p>
+    <w:p>
+      <w:pPr>
+        <w:rPr>
+          <w:rStyle w:val="Textoennegrita"/>
+          <w:rFonts w:ascii="Palatino Linotype" w:eastAsiaTheme="majorEastAsia" w:hAnsi="Palatino Linotype" w:cstheme="majorBidi"/>
+          <w:b w:val="0"/>
+          <w:bCs w:val="0"/>
+          <w:color w:val="000000"/>
+          <w:sz w:val="22"/>
+          <w:szCs w:val="22"/>
+          <w:lang w:val="en-US"/>
+        </w:rPr>
+      </w:pPr>
+      <w:proofErr w:type="spellStart"/>
+      <w:r>
+        <w:rPr>
+          <w:rStyle w:val="Textoennegrita"/>
+          <w:rFonts w:ascii="Palatino Linotype" w:eastAsiaTheme="majorEastAsia" w:hAnsi="Palatino Linotype" w:cstheme="majorBidi"/>
+          <w:b w:val="0"/>
+          <w:bCs w:val="0"/>
+          <w:color w:val="000000"/>
+          <w:sz w:val="22"/>
+          <w:szCs w:val="22"/>
+          <w:lang w:val="en-US"/>
+        </w:rPr>
+        <w:t>Crear</w:t>
+      </w:r>
+      <w:proofErr w:type="spellEnd"/>
+      <w:r>
+        <w:rPr>
+          <w:rStyle w:val="Textoennegrita"/>
+          <w:rFonts w:ascii="Palatino Linotype" w:eastAsiaTheme="majorEastAsia" w:hAnsi="Palatino Linotype" w:cstheme="majorBidi"/>
+          <w:b w:val="0"/>
+          <w:bCs w:val="0"/>
+          <w:color w:val="000000"/>
+          <w:sz w:val="22"/>
+          <w:szCs w:val="22"/>
+          <w:lang w:val="en-US"/>
+        </w:rPr>
+        <w:t xml:space="preserve"> </w:t>
+      </w:r>
+      <w:proofErr w:type="spellStart"/>
+      <w:r>
+        <w:rPr>
+          <w:rStyle w:val="Textoennegrita"/>
+          <w:rFonts w:ascii="Palatino Linotype" w:eastAsiaTheme="majorEastAsia" w:hAnsi="Palatino Linotype" w:cstheme="majorBidi"/>
+          <w:b w:val="0"/>
+          <w:bCs w:val="0"/>
+          <w:color w:val="000000"/>
+          <w:sz w:val="22"/>
+          <w:szCs w:val="22"/>
+          <w:lang w:val="en-US"/>
+        </w:rPr>
+        <w:t>seccion</w:t>
+      </w:r>
+      <w:proofErr w:type="spellEnd"/>
+      <w:r>
+        <w:rPr>
+          <w:rStyle w:val="Textoennegrita"/>
+          <w:rFonts w:ascii="Palatino Linotype" w:eastAsiaTheme="majorEastAsia" w:hAnsi="Palatino Linotype" w:cstheme="majorBidi"/>
+          <w:b w:val="0"/>
+          <w:bCs w:val="0"/>
+          <w:color w:val="000000"/>
+          <w:sz w:val="22"/>
+          <w:szCs w:val="22"/>
+          <w:lang w:val="en-US"/>
+        </w:rPr>
+        <w:t xml:space="preserve"> Contact antes del footer y </w:t>
+      </w:r>
+      <w:proofErr w:type="spellStart"/>
+      <w:r>
+        <w:rPr>
+          <w:rStyle w:val="Textoennegrita"/>
+          <w:rFonts w:ascii="Palatino Linotype" w:eastAsiaTheme="majorEastAsia" w:hAnsi="Palatino Linotype" w:cstheme="majorBidi"/>
+          <w:b w:val="0"/>
+          <w:bCs w:val="0"/>
+          <w:color w:val="000000"/>
+          <w:sz w:val="22"/>
+          <w:szCs w:val="22"/>
+          <w:lang w:val="en-US"/>
+        </w:rPr>
+        <w:t>debajo</w:t>
+      </w:r>
+      <w:proofErr w:type="spellEnd"/>
+      <w:r>
+        <w:rPr>
+          <w:rStyle w:val="Textoennegrita"/>
+          <w:rFonts w:ascii="Palatino Linotype" w:eastAsiaTheme="majorEastAsia" w:hAnsi="Palatino Linotype" w:cstheme="majorBidi"/>
+          <w:b w:val="0"/>
+          <w:bCs w:val="0"/>
+          <w:color w:val="000000"/>
+          <w:sz w:val="22"/>
+          <w:szCs w:val="22"/>
+          <w:lang w:val="en-US"/>
+        </w:rPr>
+        <w:t xml:space="preserve"> de la </w:t>
+      </w:r>
+      <w:proofErr w:type="spellStart"/>
+      <w:r>
+        <w:rPr>
+          <w:rStyle w:val="Textoennegrita"/>
+          <w:rFonts w:ascii="Palatino Linotype" w:eastAsiaTheme="majorEastAsia" w:hAnsi="Palatino Linotype" w:cstheme="majorBidi"/>
+          <w:b w:val="0"/>
+          <w:bCs w:val="0"/>
+          <w:color w:val="000000"/>
+          <w:sz w:val="22"/>
+          <w:szCs w:val="22"/>
+          <w:lang w:val="en-US"/>
+        </w:rPr>
+        <w:t>seccion</w:t>
+      </w:r>
+      <w:proofErr w:type="spellEnd"/>
+      <w:r>
+        <w:rPr>
+          <w:rStyle w:val="Textoennegrita"/>
+          <w:rFonts w:ascii="Palatino Linotype" w:eastAsiaTheme="majorEastAsia" w:hAnsi="Palatino Linotype" w:cstheme="majorBidi"/>
+          <w:b w:val="0"/>
+          <w:bCs w:val="0"/>
+          <w:color w:val="000000"/>
+          <w:sz w:val="22"/>
+          <w:szCs w:val="22"/>
+          <w:lang w:val="en-US"/>
+        </w:rPr>
+        <w:t xml:space="preserve"> Publications</w:t>
+      </w:r>
+    </w:p>
+    <w:p>
+      <w:pPr>
+        <w:rPr>
+          <w:rStyle w:val="Textoennegrita"/>
+          <w:rFonts w:ascii="Palatino Linotype" w:eastAsiaTheme="majorEastAsia" w:hAnsi="Palatino Linotype" w:cstheme="majorBidi"/>
+          <w:b w:val="0"/>
+          <w:bCs w:val="0"/>
+          <w:color w:val="000000"/>
+          <w:sz w:val="22"/>
+          <w:szCs w:val="22"/>
+          <w:lang w:val="en-US"/>
+        </w:rPr>
+      </w:pPr>
+    </w:p>
+    <w:p>
+      <w:pPr>
+        <w:rPr>
+          <w:rStyle w:val="Textoennegrita"/>
+          <w:rFonts w:ascii="Palatino Linotype" w:eastAsiaTheme="majorEastAsia" w:hAnsi="Palatino Linotype" w:cstheme="majorBidi"/>
+          <w:b w:val="0"/>
+          <w:bCs w:val="0"/>
+          <w:color w:val="000000"/>
+          <w:sz w:val="22"/>
+          <w:szCs w:val="22"/>
+          <w:lang w:val="en-US"/>
+        </w:rPr>
+      </w:pPr>
+    </w:p>
+    <w:p>
+      <w:pPr>
+        <w:rPr>
+          <w:rStyle w:val="Textoennegrita"/>
+          <w:rFonts w:ascii="Palatino Linotype" w:eastAsiaTheme="majorEastAsia" w:hAnsi="Palatino Linotype" w:cstheme="majorBidi"/>
+          <w:b w:val="0"/>
+          <w:bCs w:val="0"/>
+          <w:color w:val="000000"/>
+          <w:sz w:val="22"/>
+          <w:szCs w:val="22"/>
+          <w:lang w:val="en-US"/>
+        </w:rPr>
+      </w:pPr>
+      <w:r>
+        <w:rPr>
+          <w:rStyle w:val="Textoennegrita"/>
+          <w:rFonts w:ascii="Palatino Linotype" w:eastAsiaTheme="majorEastAsia" w:hAnsi="Palatino Linotype" w:cstheme="majorBidi"/>
+          <w:b w:val="0"/>
+          <w:bCs w:val="0"/>
+          <w:color w:val="000000"/>
+          <w:sz w:val="22"/>
+          <w:szCs w:val="22"/>
+          <w:lang w:val="en-US"/>
+        </w:rPr>
+        <w:t xml:space="preserve">Publication debe </w:t>
+      </w:r>
+      <w:proofErr w:type="spellStart"/>
+      <w:r>
+        <w:rPr>
+          <w:rStyle w:val="Textoennegrita"/>
+          <w:rFonts w:ascii="Palatino Linotype" w:eastAsiaTheme="majorEastAsia" w:hAnsi="Palatino Linotype" w:cstheme="majorBidi"/>
+          <w:b w:val="0"/>
+          <w:bCs w:val="0"/>
+          <w:color w:val="000000"/>
+          <w:sz w:val="22"/>
+          <w:szCs w:val="22"/>
+          <w:lang w:val="en-US"/>
+        </w:rPr>
+        <w:t>mostras</w:t>
+      </w:r>
+      <w:proofErr w:type="spellEnd"/>
+      <w:r>
+        <w:rPr>
+          <w:rStyle w:val="Textoennegrita"/>
+          <w:rFonts w:ascii="Palatino Linotype" w:eastAsiaTheme="majorEastAsia" w:hAnsi="Palatino Linotype" w:cstheme="majorBidi"/>
+          <w:b w:val="0"/>
+          <w:bCs w:val="0"/>
+          <w:color w:val="000000"/>
+          <w:sz w:val="22"/>
+          <w:szCs w:val="22"/>
+          <w:lang w:val="en-US"/>
+        </w:rPr>
+        <w:t xml:space="preserve"> 2 </w:t>
+      </w:r>
+      <w:proofErr w:type="spellStart"/>
+      <w:r>
+        <w:rPr>
+          <w:rStyle w:val="Textoennegrita"/>
+          <w:rFonts w:ascii="Palatino Linotype" w:eastAsiaTheme="majorEastAsia" w:hAnsi="Palatino Linotype" w:cstheme="majorBidi"/>
+          <w:b w:val="0"/>
+          <w:bCs w:val="0"/>
+          <w:color w:val="000000"/>
+          <w:sz w:val="22"/>
+          <w:szCs w:val="22"/>
+          <w:lang w:val="en-US"/>
+        </w:rPr>
+        <w:t>lineas</w:t>
+      </w:r>
+      <w:proofErr w:type="spellEnd"/>
+      <w:r>
+        <w:rPr>
+          <w:rStyle w:val="Textoennegrita"/>
+          <w:rFonts w:ascii="Palatino Linotype" w:eastAsiaTheme="majorEastAsia" w:hAnsi="Palatino Linotype" w:cstheme="majorBidi"/>
+          <w:b w:val="0"/>
+          <w:bCs w:val="0"/>
+          <w:color w:val="000000"/>
+          <w:sz w:val="22"/>
+          <w:szCs w:val="22"/>
+          <w:lang w:val="en-US"/>
+        </w:rPr>
+        <w:t xml:space="preserve"> </w:t>
+      </w:r>
+      <w:proofErr w:type="spellStart"/>
+      <w:r>
+        <w:rPr>
+          <w:rStyle w:val="Textoennegrita"/>
+          <w:rFonts w:ascii="Palatino Linotype" w:eastAsiaTheme="majorEastAsia" w:hAnsi="Palatino Linotype" w:cstheme="majorBidi"/>
+          <w:b w:val="0"/>
+          <w:bCs w:val="0"/>
+          <w:color w:val="000000"/>
+          <w:sz w:val="22"/>
+          <w:szCs w:val="22"/>
+          <w:lang w:val="en-US"/>
+        </w:rPr>
+        <w:t>horizontales</w:t>
+      </w:r>
+      <w:proofErr w:type="spellEnd"/>
+      <w:r>
+        <w:rPr>
+          <w:rStyle w:val="Textoennegrita"/>
+          <w:rFonts w:ascii="Palatino Linotype" w:eastAsiaTheme="majorEastAsia" w:hAnsi="Palatino Linotype" w:cstheme="majorBidi"/>
+          <w:b w:val="0"/>
+          <w:bCs w:val="0"/>
+          <w:color w:val="000000"/>
+          <w:sz w:val="22"/>
+          <w:szCs w:val="22"/>
+          <w:lang w:val="en-US"/>
+        </w:rPr>
+        <w:t xml:space="preserve"> de 4 </w:t>
+      </w:r>
+      <w:proofErr w:type="spellStart"/>
+      <w:r>
+        <w:rPr>
+          <w:rStyle w:val="Textoennegrita"/>
+          <w:rFonts w:ascii="Palatino Linotype" w:eastAsiaTheme="majorEastAsia" w:hAnsi="Palatino Linotype" w:cstheme="majorBidi"/>
+          <w:b w:val="0"/>
+          <w:bCs w:val="0"/>
+          <w:color w:val="000000"/>
+          <w:sz w:val="22"/>
+          <w:szCs w:val="22"/>
+          <w:lang w:val="en-US"/>
+        </w:rPr>
+        <w:t>tarjetas</w:t>
+      </w:r>
+      <w:proofErr w:type="spellEnd"/>
+      <w:r>
+        <w:rPr>
+          <w:rStyle w:val="Textoennegrita"/>
+          <w:rFonts w:ascii="Palatino Linotype" w:eastAsiaTheme="majorEastAsia" w:hAnsi="Palatino Linotype" w:cstheme="majorBidi"/>
+          <w:b w:val="0"/>
+          <w:bCs w:val="0"/>
+          <w:color w:val="000000"/>
+          <w:sz w:val="22"/>
+          <w:szCs w:val="22"/>
+          <w:lang w:val="en-US"/>
+        </w:rPr>
+        <w:t xml:space="preserve"> </w:t>
+      </w:r>
+      <w:proofErr w:type="spellStart"/>
+      <w:r>
+        <w:rPr>
+          <w:rStyle w:val="Textoennegrita"/>
+          <w:rFonts w:ascii="Palatino Linotype" w:eastAsiaTheme="majorEastAsia" w:hAnsi="Palatino Linotype" w:cstheme="majorBidi"/>
+          <w:b w:val="0"/>
+          <w:bCs w:val="0"/>
+          <w:color w:val="000000"/>
+          <w:sz w:val="22"/>
+          <w:szCs w:val="22"/>
+          <w:lang w:val="en-US"/>
+        </w:rPr>
+        <w:t>cada</w:t>
+      </w:r>
+      <w:proofErr w:type="spellEnd"/>
+      <w:r>
+        <w:rPr>
+          <w:rStyle w:val="Textoennegrita"/>
+          <w:rFonts w:ascii="Palatino Linotype" w:eastAsiaTheme="majorEastAsia" w:hAnsi="Palatino Linotype" w:cstheme="majorBidi"/>
+          <w:b w:val="0"/>
+          <w:bCs w:val="0"/>
+          <w:color w:val="000000"/>
+          <w:sz w:val="22"/>
+          <w:szCs w:val="22"/>
+          <w:lang w:val="en-US"/>
+        </w:rPr>
+        <w:t xml:space="preserve"> </w:t>
+      </w:r>
+      <w:r>
+        <w:rPr>
+          <w:rStyle w:val="Textoennegrita"/>
+          <w:rFonts w:ascii="Palatino Linotype" w:eastAsiaTheme="majorEastAsia" w:hAnsi="Palatino Linotype" w:cstheme="majorBidi"/>
+          <w:b w:val="0"/>
+          <w:bCs w:val="0"/>
+          <w:color w:val="000000"/>
+          <w:sz w:val="22"/>
+          <w:szCs w:val="22"/>
+          <w:lang w:val="en-US"/>
+        </w:rPr>
+        <w:t xml:space="preserve">una </w:t>
+      </w:r>
+      <w:proofErr w:type="spellStart"/>
+      <w:r>
+        <w:rPr>
+          <w:rStyle w:val="Textoennegrita"/>
+          <w:rFonts w:ascii="Palatino Linotype" w:eastAsiaTheme="majorEastAsia" w:hAnsi="Palatino Linotype" w:cstheme="majorBidi"/>
+          <w:b w:val="0"/>
+          <w:bCs w:val="0"/>
+          <w:color w:val="000000"/>
+          <w:sz w:val="22"/>
+          <w:szCs w:val="22"/>
+          <w:lang w:val="en-US"/>
+        </w:rPr>
+        <w:t>en</w:t>
+      </w:r>
+      <w:proofErr w:type="spellEnd"/>
+      <w:r>
+        <w:rPr>
+          <w:rStyle w:val="Textoennegrita"/>
+          <w:rFonts w:ascii="Palatino Linotype" w:eastAsiaTheme="majorEastAsia" w:hAnsi="Palatino Linotype" w:cstheme="majorBidi"/>
+          <w:b w:val="0"/>
+          <w:bCs w:val="0"/>
+          <w:color w:val="000000"/>
+          <w:sz w:val="22"/>
+          <w:szCs w:val="22"/>
+          <w:lang w:val="en-US"/>
+        </w:rPr>
+        <w:t xml:space="preserve"> la version desktop. </w:t>
+      </w:r>
+    </w:p>
+    <w:p>
+      <w:pPr>
+        <w:rPr>
+          <w:rStyle w:val="Textoennegrita"/>
+          <w:rFonts w:ascii="Palatino Linotype" w:eastAsiaTheme="majorEastAsia" w:hAnsi="Palatino Linotype" w:cstheme="majorBidi"/>
+          <w:b w:val="0"/>
+          <w:bCs w:val="0"/>
+          <w:color w:val="000000"/>
+          <w:sz w:val="22"/>
+          <w:szCs w:val="22"/>
+          <w:lang w:val="en-US"/>
+        </w:rPr>
+      </w:pPr>
+      <w:proofErr w:type="spellStart"/>
+      <w:r>
+        <w:rPr>
+          <w:rStyle w:val="Textoennegrita"/>
+          <w:rFonts w:ascii="Palatino Linotype" w:eastAsiaTheme="majorEastAsia" w:hAnsi="Palatino Linotype" w:cstheme="majorBidi"/>
+          <w:b w:val="0"/>
+          <w:bCs w:val="0"/>
+          <w:color w:val="000000"/>
+          <w:sz w:val="22"/>
+          <w:szCs w:val="22"/>
+          <w:lang w:val="en-US"/>
+        </w:rPr>
+        <w:t>Boton</w:t>
+      </w:r>
+      <w:proofErr w:type="spellEnd"/>
+      <w:r>
+        <w:rPr>
+          <w:rStyle w:val="Textoennegrita"/>
+          <w:rFonts w:ascii="Palatino Linotype" w:eastAsiaTheme="majorEastAsia" w:hAnsi="Palatino Linotype" w:cstheme="majorBidi"/>
+          <w:b w:val="0"/>
+          <w:bCs w:val="0"/>
+          <w:color w:val="000000"/>
+          <w:sz w:val="22"/>
+          <w:szCs w:val="22"/>
+          <w:lang w:val="en-US"/>
+        </w:rPr>
+        <w:t xml:space="preserve"> y function “</w:t>
+      </w:r>
+      <w:proofErr w:type="spellStart"/>
+      <w:r>
+        <w:rPr>
+          <w:rStyle w:val="Textoennegrita"/>
+          <w:rFonts w:ascii="Palatino Linotype" w:eastAsiaTheme="majorEastAsia" w:hAnsi="Palatino Linotype" w:cstheme="majorBidi"/>
+          <w:b w:val="0"/>
+          <w:bCs w:val="0"/>
+          <w:color w:val="000000"/>
+          <w:sz w:val="22"/>
+          <w:szCs w:val="22"/>
+          <w:lang w:val="en-US"/>
+        </w:rPr>
+        <w:t>Mostrar</w:t>
+      </w:r>
+      <w:proofErr w:type="spellEnd"/>
+      <w:r>
+        <w:rPr>
+          <w:rStyle w:val="Textoennegrita"/>
+          <w:rFonts w:ascii="Palatino Linotype" w:eastAsiaTheme="majorEastAsia" w:hAnsi="Palatino Linotype" w:cstheme="majorBidi"/>
+          <w:b w:val="0"/>
+          <w:bCs w:val="0"/>
+          <w:color w:val="000000"/>
+          <w:sz w:val="22"/>
+          <w:szCs w:val="22"/>
+          <w:lang w:val="en-US"/>
+        </w:rPr>
+        <w:t xml:space="preserve"> mas” se </w:t>
+      </w:r>
+      <w:proofErr w:type="spellStart"/>
+      <w:r>
+        <w:rPr>
+          <w:rStyle w:val="Textoennegrita"/>
+          <w:rFonts w:ascii="Palatino Linotype" w:eastAsiaTheme="majorEastAsia" w:hAnsi="Palatino Linotype" w:cstheme="majorBidi"/>
+          <w:b w:val="0"/>
+          <w:bCs w:val="0"/>
+          <w:color w:val="000000"/>
+          <w:sz w:val="22"/>
+          <w:szCs w:val="22"/>
+          <w:lang w:val="en-US"/>
+        </w:rPr>
+        <w:t>mantienen</w:t>
+      </w:r>
+      <w:proofErr w:type="spellEnd"/>
+      <w:r>
+        <w:rPr>
+          <w:rStyle w:val="Textoennegrita"/>
+          <w:rFonts w:ascii="Palatino Linotype" w:eastAsiaTheme="majorEastAsia" w:hAnsi="Palatino Linotype" w:cstheme="majorBidi"/>
+          <w:b w:val="0"/>
+          <w:bCs w:val="0"/>
+          <w:color w:val="000000"/>
+          <w:sz w:val="22"/>
+          <w:szCs w:val="22"/>
+          <w:lang w:val="en-US"/>
+        </w:rPr>
+        <w:t>.</w:t>
+      </w:r>
+    </w:p>
+    <w:p>
+      <w:pPr>
+        <w:rPr>
+          <w:rStyle w:val="Textoennegrita"/>
+          <w:rFonts w:ascii="Palatino Linotype" w:eastAsiaTheme="majorEastAsia" w:hAnsi="Palatino Linotype" w:cstheme="majorBidi"/>
+          <w:b w:val="0"/>
+          <w:bCs w:val="0"/>
+          <w:color w:val="000000"/>
+          <w:sz w:val="22"/>
+          <w:szCs w:val="22"/>
+          <w:lang w:val="en-US"/>
+        </w:rPr>
+      </w:pPr>
+    </w:p>
+    <w:p>
+      <w:pPr>
+        <w:rPr>
+          <w:rStyle w:val="Textoennegrita"/>
+          <w:rFonts w:ascii="Palatino Linotype" w:eastAsiaTheme="majorEastAsia" w:hAnsi="Palatino Linotype" w:cstheme="majorBidi"/>
+          <w:b w:val="0"/>
+          <w:bCs w:val="0"/>
+          <w:color w:val="000000"/>
+          <w:sz w:val="22"/>
+          <w:szCs w:val="22"/>
+          <w:lang w:val="en-US"/>
+        </w:rPr>
+      </w:pPr>
+      <w:proofErr w:type="spellStart"/>
+      <w:r>
+        <w:rPr>
+          <w:rStyle w:val="Textoennegrita"/>
+          <w:rFonts w:ascii="Palatino Linotype" w:eastAsiaTheme="majorEastAsia" w:hAnsi="Palatino Linotype" w:cstheme="majorBidi"/>
+          <w:b w:val="0"/>
+          <w:bCs w:val="0"/>
+          <w:color w:val="000000"/>
+          <w:sz w:val="22"/>
+          <w:szCs w:val="22"/>
+          <w:lang w:val="en-US"/>
+        </w:rPr>
+        <w:t>Cambiar</w:t>
+      </w:r>
+      <w:proofErr w:type="spellEnd"/>
+      <w:r>
+        <w:rPr>
+          <w:rStyle w:val="Textoennegrita"/>
+          <w:rFonts w:ascii="Palatino Linotype" w:eastAsiaTheme="majorEastAsia" w:hAnsi="Palatino Linotype" w:cstheme="majorBidi"/>
+          <w:b w:val="0"/>
+          <w:bCs w:val="0"/>
+          <w:color w:val="000000"/>
+          <w:sz w:val="22"/>
+          <w:szCs w:val="22"/>
+          <w:lang w:val="en-US"/>
+        </w:rPr>
+        <w:t xml:space="preserve"> “About” por “About us” e</w:t>
+      </w:r>
+      <w:proofErr w:type="spellStart"/>
+      <w:r>
+        <w:rPr>
+          <w:rStyle w:val="Textoennegrita"/>
+          <w:rFonts w:ascii="Palatino Linotype" w:eastAsiaTheme="majorEastAsia" w:hAnsi="Palatino Linotype" w:cstheme="majorBidi"/>
+          <w:b w:val="0"/>
+          <w:bCs w:val="0"/>
+          <w:color w:val="000000"/>
+          <w:sz w:val="22"/>
+          <w:szCs w:val="22"/>
+          <w:lang w:val="en-US"/>
+        </w:rPr>
+        <w:t>n</w:t>
+      </w:r>
+      <w:proofErr w:type="spellEnd"/>
+      <w:r>
+        <w:rPr>
+          <w:rStyle w:val="Textoennegrita"/>
+          <w:rFonts w:ascii="Palatino Linotype" w:eastAsiaTheme="majorEastAsia" w:hAnsi="Palatino Linotype" w:cstheme="majorBidi"/>
+          <w:b w:val="0"/>
+          <w:bCs w:val="0"/>
+          <w:color w:val="000000"/>
+          <w:sz w:val="22"/>
+          <w:szCs w:val="22"/>
+          <w:lang w:val="en-US"/>
+        </w:rPr>
+        <w:t xml:space="preserve"> la </w:t>
+      </w:r>
+      <w:proofErr w:type="spellStart"/>
+      <w:r>
+        <w:rPr>
+          <w:rStyle w:val="Textoennegrita"/>
+          <w:rFonts w:ascii="Palatino Linotype" w:eastAsiaTheme="majorEastAsia" w:hAnsi="Palatino Linotype" w:cstheme="majorBidi"/>
+          <w:b w:val="0"/>
+          <w:bCs w:val="0"/>
+          <w:color w:val="000000"/>
+          <w:sz w:val="22"/>
+          <w:szCs w:val="22"/>
+          <w:lang w:val="en-US"/>
+        </w:rPr>
+        <w:t>pagina</w:t>
+      </w:r>
+      <w:proofErr w:type="spellEnd"/>
+      <w:r>
+        <w:rPr>
+          <w:rStyle w:val="Textoennegrita"/>
+          <w:rFonts w:ascii="Palatino Linotype" w:eastAsiaTheme="majorEastAsia" w:hAnsi="Palatino Linotype" w:cstheme="majorBidi"/>
+          <w:b w:val="0"/>
+          <w:bCs w:val="0"/>
+          <w:color w:val="000000"/>
+          <w:sz w:val="22"/>
+          <w:szCs w:val="22"/>
+          <w:lang w:val="en-US"/>
+        </w:rPr>
+        <w:t xml:space="preserve"> y </w:t>
+      </w:r>
+      <w:proofErr w:type="spellStart"/>
+      <w:r>
+        <w:rPr>
+          <w:rStyle w:val="Textoennegrita"/>
+          <w:rFonts w:ascii="Palatino Linotype" w:eastAsiaTheme="majorEastAsia" w:hAnsi="Palatino Linotype" w:cstheme="majorBidi"/>
+          <w:b w:val="0"/>
+          <w:bCs w:val="0"/>
+          <w:color w:val="000000"/>
+          <w:sz w:val="22"/>
+          <w:szCs w:val="22"/>
+          <w:lang w:val="en-US"/>
+        </w:rPr>
+        <w:t>en</w:t>
+      </w:r>
+      <w:proofErr w:type="spellEnd"/>
+      <w:r>
+        <w:rPr>
+          <w:rStyle w:val="Textoennegrita"/>
+          <w:rFonts w:ascii="Palatino Linotype" w:eastAsiaTheme="majorEastAsia" w:hAnsi="Palatino Linotype" w:cstheme="majorBidi"/>
+          <w:b w:val="0"/>
+          <w:bCs w:val="0"/>
+          <w:color w:val="000000"/>
+          <w:sz w:val="22"/>
+          <w:szCs w:val="22"/>
+          <w:lang w:val="en-US"/>
+        </w:rPr>
+        <w:t xml:space="preserve"> </w:t>
+      </w:r>
+      <w:proofErr w:type="spellStart"/>
+      <w:r>
+        <w:rPr>
+          <w:rStyle w:val="Textoennegrita"/>
+          <w:rFonts w:ascii="Palatino Linotype" w:eastAsiaTheme="majorEastAsia" w:hAnsi="Palatino Linotype" w:cstheme="majorBidi"/>
+          <w:b w:val="0"/>
+          <w:bCs w:val="0"/>
+          <w:color w:val="000000"/>
+          <w:sz w:val="22"/>
+          <w:szCs w:val="22"/>
+          <w:lang w:val="en-US"/>
+        </w:rPr>
+        <w:t>el</w:t>
+      </w:r>
+      <w:proofErr w:type="spellEnd"/>
+      <w:r>
+        <w:rPr>
+          <w:rStyle w:val="Textoennegrita"/>
+          <w:rFonts w:ascii="Palatino Linotype" w:eastAsiaTheme="majorEastAsia" w:hAnsi="Palatino Linotype" w:cstheme="majorBidi"/>
+          <w:b w:val="0"/>
+          <w:bCs w:val="0"/>
+          <w:color w:val="000000"/>
+          <w:sz w:val="22"/>
+          <w:szCs w:val="22"/>
+          <w:lang w:val="en-US"/>
+        </w:rPr>
+        <w:t xml:space="preserve"> Menu</w:t>
+      </w:r>
+      <w:r>
+        <w:rPr>
+          <w:rStyle w:val="Textoennegrita"/>
+          <w:rFonts w:ascii="Palatino Linotype" w:eastAsiaTheme="majorEastAsia" w:hAnsi="Palatino Linotype" w:cstheme="majorBidi"/>
+          <w:b w:val="0"/>
+          <w:bCs w:val="0"/>
+          <w:color w:val="000000"/>
+          <w:sz w:val="22"/>
+          <w:szCs w:val="22"/>
+          <w:lang w:val="en-US"/>
+        </w:rPr>
+        <w:br/>
+      </w:r>
+    </w:p>
+    <w:p>
+      <w:pPr>
+        <w:rPr>
+          <w:rStyle w:val="Textoennegrita"/>
+          <w:rFonts w:ascii="Palatino Linotype" w:eastAsiaTheme="majorEastAsia" w:hAnsi="Palatino Linotype" w:cstheme="majorBidi"/>
+          <w:b w:val="0"/>
+          <w:bCs w:val="0"/>
+          <w:color w:val="000000"/>
+          <w:sz w:val="22"/>
+          <w:szCs w:val="22"/>
+          <w:lang w:val="en-US"/>
+        </w:rPr>
+      </w:pPr>
+      <w:proofErr w:type="spellStart"/>
+      <w:r>
+        <w:rPr>
+          <w:rStyle w:val="Textoennegrita"/>
+          <w:rFonts w:ascii="Palatino Linotype" w:eastAsiaTheme="majorEastAsia" w:hAnsi="Palatino Linotype" w:cstheme="majorBidi"/>
+          <w:b w:val="0"/>
+          <w:bCs w:val="0"/>
+          <w:color w:val="000000"/>
+          <w:sz w:val="22"/>
+          <w:szCs w:val="22"/>
+          <w:lang w:val="en-US"/>
+        </w:rPr>
+        <w:t>Modificar</w:t>
+      </w:r>
+      <w:proofErr w:type="spellEnd"/>
+      <w:r>
+        <w:rPr>
+          <w:rStyle w:val="Textoennegrita"/>
+          <w:rFonts w:ascii="Palatino Linotype" w:eastAsiaTheme="majorEastAsia" w:hAnsi="Palatino Linotype" w:cstheme="majorBidi"/>
+          <w:b w:val="0"/>
+          <w:bCs w:val="0"/>
+          <w:color w:val="000000"/>
+          <w:sz w:val="22"/>
+          <w:szCs w:val="22"/>
+          <w:lang w:val="en-US"/>
+        </w:rPr>
+        <w:t xml:space="preserve"> about-text por </w:t>
+      </w:r>
+      <w:proofErr w:type="spellStart"/>
+      <w:r>
+        <w:rPr>
+          <w:rStyle w:val="Textoennegrita"/>
+          <w:rFonts w:ascii="Palatino Linotype" w:eastAsiaTheme="majorEastAsia" w:hAnsi="Palatino Linotype" w:cstheme="majorBidi"/>
+          <w:b w:val="0"/>
+          <w:bCs w:val="0"/>
+          <w:color w:val="000000"/>
+          <w:sz w:val="22"/>
+          <w:szCs w:val="22"/>
+          <w:lang w:val="en-US"/>
+        </w:rPr>
+        <w:t>este</w:t>
+      </w:r>
+      <w:proofErr w:type="spellEnd"/>
+      <w:r>
+        <w:rPr>
+          <w:rStyle w:val="Textoennegrita"/>
+          <w:rFonts w:ascii="Palatino Linotype" w:eastAsiaTheme="majorEastAsia" w:hAnsi="Palatino Linotype" w:cstheme="majorBidi"/>
+          <w:b w:val="0"/>
+          <w:bCs w:val="0"/>
+          <w:color w:val="000000"/>
+          <w:sz w:val="22"/>
+          <w:szCs w:val="22"/>
+          <w:lang w:val="en-US"/>
+        </w:rPr>
+        <w:t xml:space="preserve">: </w:t>
+      </w:r>
+      <w:r>
+        <w:rPr>
+          <w:rStyle w:val="Textoennegrita"/>
+          <w:rFonts w:ascii="Palatino Linotype" w:eastAsiaTheme="majorEastAsia" w:hAnsi="Palatino Linotype" w:cstheme="majorBidi"/>
+          <w:b w:val="0"/>
+          <w:bCs w:val="0"/>
+          <w:color w:val="000000"/>
+          <w:sz w:val="22"/>
+          <w:szCs w:val="22"/>
+          <w:lang w:val="en-US"/>
+        </w:rPr>
+        <w:br/>
+      </w:r>
+    </w:p>
+    <w:p>
+      <w:pPr>
+        <w:rPr>
+          <w:rStyle w:val="Textoennegrita"/>
+          <w:rFonts w:ascii="Palatino Linotype" w:eastAsiaTheme="majorEastAsia" w:hAnsi="Palatino Linotype" w:cstheme="majorBidi"/>
+          <w:b w:val="0"/>
+          <w:bCs w:val="0"/>
+          <w:color w:val="000000"/>
+          <w:sz w:val="22"/>
+          <w:szCs w:val="22"/>
+          <w:lang w:val="en-US"/>
+        </w:rPr>
+      </w:pPr>
+      <w:r>
+        <w:rPr>
+          <w:rStyle w:val="Textoennegrita"/>
+          <w:rFonts w:ascii="Palatino Linotype" w:eastAsiaTheme="majorEastAsia" w:hAnsi="Palatino Linotype" w:cstheme="majorBidi"/>
+          <w:b w:val="0"/>
+          <w:bCs w:val="0"/>
+          <w:color w:val="000000"/>
+          <w:sz w:val="22"/>
+          <w:szCs w:val="22"/>
+          <w:lang w:val="en-US"/>
+        </w:rPr>
+        <w:br w:type="column"/>
+      </w:r>
+      <w:r>
+        <w:rPr>
+          <w:rStyle w:val="Textoennegrita"/>
+          <w:rFonts w:ascii="Palatino Linotype" w:eastAsiaTheme="majorEastAsia" w:hAnsi="Palatino Linotype" w:cstheme="majorBidi"/>
+          <w:b w:val="0"/>
+          <w:bCs w:val="0"/>
+          <w:color w:val="000000"/>
+          <w:sz w:val="22"/>
+          <w:szCs w:val="22"/>
+          <w:lang w:val="en-US"/>
+        </w:rPr>
+        <w:t>Our research investigates how air pollution affects reproductive health and early development. Using controlled animal exposure models, we examine the impact of PM2.5 on fetal morphology, bone development, the placenta, umbilical cord, and other organs associated with reproductive success.</w:t>
+      </w:r>
+    </w:p>
+    <w:p>
+      <w:pPr>
+        <w:rPr>
+          <w:rStyle w:val="Textoennegrita"/>
+          <w:rFonts w:ascii="Palatino Linotype" w:eastAsiaTheme="majorEastAsia" w:hAnsi="Palatino Linotype" w:cstheme="majorBidi"/>
+          <w:b w:val="0"/>
+          <w:bCs w:val="0"/>
+          <w:color w:val="000000"/>
+          <w:sz w:val="22"/>
+          <w:szCs w:val="22"/>
+          <w:lang w:val="en-US"/>
+        </w:rPr>
+      </w:pPr>
+    </w:p>
+    <w:p>
+      <w:pPr>
+        <w:rPr>
+          <w:rStyle w:val="Textoennegrita"/>
+          <w:rFonts w:ascii="Palatino Linotype" w:eastAsiaTheme="majorEastAsia" w:hAnsi="Palatino Linotype" w:cstheme="majorBidi"/>
+          <w:b w:val="0"/>
+          <w:bCs w:val="0"/>
+          <w:color w:val="000000"/>
+          <w:sz w:val="22"/>
+          <w:szCs w:val="22"/>
+          <w:lang w:val="en-US"/>
+        </w:rPr>
+      </w:pPr>
+      <w:r>
+        <w:rPr>
+          <w:rStyle w:val="Textoennegrita"/>
+          <w:rFonts w:ascii="Palatino Linotype" w:eastAsiaTheme="majorEastAsia" w:hAnsi="Palatino Linotype" w:cstheme="majorBidi"/>
+          <w:b w:val="0"/>
+          <w:bCs w:val="0"/>
+          <w:color w:val="000000"/>
+          <w:sz w:val="22"/>
+          <w:szCs w:val="22"/>
+          <w:lang w:val="en-US"/>
+        </w:rPr>
+        <w:t>In parallel, we conduct comparative anatomy studies on wild species through an interdisciplinary approach integrating veterinary medicine, ecology, and engineering. Employing tools such as micro-computed tomography (micro-CT), geometric morphometrics (GM), finite element analysis (FEA), and 3D digital reconstruction, we aim to advance anatomical, functional, and conservation knowledge of native fauna.</w:t>
+      </w:r>
+    </w:p>
+    <w:p>
+      <w:pPr>
+        <w:rPr>
+          <w:rStyle w:val="Textoennegrita"/>
+          <w:rFonts w:ascii="Palatino Linotype" w:eastAsiaTheme="majorEastAsia" w:hAnsi="Palatino Linotype" w:cstheme="majorBidi"/>
+          <w:b w:val="0"/>
+          <w:bCs w:val="0"/>
+          <w:color w:val="000000"/>
+          <w:sz w:val="22"/>
+          <w:szCs w:val="22"/>
+          <w:lang w:val="en-US"/>
+        </w:rPr>
+      </w:pPr>
+    </w:p>
+    <w:p>
+      <w:pPr>
+        <w:rPr>
+          <w:rStyle w:val="Textoennegrita"/>
+          <w:rFonts w:ascii="Palatino Linotype" w:eastAsiaTheme="majorEastAsia" w:hAnsi="Palatino Linotype" w:cstheme="majorBidi"/>
+          <w:b w:val="0"/>
+          <w:bCs w:val="0"/>
+          <w:color w:val="000000"/>
+          <w:sz w:val="22"/>
+          <w:szCs w:val="22"/>
+          <w:lang w:val="en-US"/>
+        </w:rPr>
+      </w:pPr>
+      <w:r>
+        <w:rPr>
+          <w:rStyle w:val="Textoennegrita"/>
+          <w:rFonts w:ascii="Palatino Linotype" w:eastAsiaTheme="majorEastAsia" w:hAnsi="Palatino Linotype" w:cstheme="majorBidi"/>
+          <w:b w:val="0"/>
+          <w:bCs w:val="0"/>
+          <w:color w:val="000000"/>
+          <w:sz w:val="22"/>
+          <w:szCs w:val="22"/>
+          <w:lang w:val="en-US"/>
+        </w:rPr>
+        <w:t xml:space="preserve">Se </w:t>
+      </w:r>
+      <w:proofErr w:type="spellStart"/>
+      <w:r>
+        <w:rPr>
+          <w:rStyle w:val="Textoennegrita"/>
+          <w:rFonts w:ascii="Palatino Linotype" w:eastAsiaTheme="majorEastAsia" w:hAnsi="Palatino Linotype" w:cstheme="majorBidi"/>
+          <w:b w:val="0"/>
+          <w:bCs w:val="0"/>
+          <w:color w:val="000000"/>
+          <w:sz w:val="22"/>
+          <w:szCs w:val="22"/>
+          <w:lang w:val="en-US"/>
+        </w:rPr>
+        <w:t>adjunta</w:t>
+      </w:r>
+      <w:proofErr w:type="spellEnd"/>
+      <w:r>
+        <w:rPr>
+          <w:rStyle w:val="Textoennegrita"/>
+          <w:rFonts w:ascii="Palatino Linotype" w:eastAsiaTheme="majorEastAsia" w:hAnsi="Palatino Linotype" w:cstheme="majorBidi"/>
+          <w:b w:val="0"/>
+          <w:bCs w:val="0"/>
+          <w:color w:val="000000"/>
+          <w:sz w:val="22"/>
+          <w:szCs w:val="22"/>
+          <w:lang w:val="en-US"/>
+        </w:rPr>
+        <w:t xml:space="preserve"> document Grants.docx con </w:t>
+      </w:r>
+      <w:proofErr w:type="spellStart"/>
+      <w:r>
+        <w:rPr>
+          <w:rStyle w:val="Textoennegrita"/>
+          <w:rFonts w:ascii="Palatino Linotype" w:eastAsiaTheme="majorEastAsia" w:hAnsi="Palatino Linotype" w:cstheme="majorBidi"/>
+          <w:b w:val="0"/>
+          <w:bCs w:val="0"/>
+          <w:color w:val="000000"/>
+          <w:sz w:val="22"/>
+          <w:szCs w:val="22"/>
+          <w:lang w:val="en-US"/>
+        </w:rPr>
+        <w:t>informacion</w:t>
+      </w:r>
+      <w:proofErr w:type="spellEnd"/>
+      <w:r>
+        <w:rPr>
+          <w:rStyle w:val="Textoennegrita"/>
+          <w:rFonts w:ascii="Palatino Linotype" w:eastAsiaTheme="majorEastAsia" w:hAnsi="Palatino Linotype" w:cstheme="majorBidi"/>
+          <w:b w:val="0"/>
+          <w:bCs w:val="0"/>
+          <w:color w:val="000000"/>
+          <w:sz w:val="22"/>
+          <w:szCs w:val="22"/>
+          <w:lang w:val="en-US"/>
+        </w:rPr>
+        <w:t xml:space="preserve"> </w:t>
+      </w:r>
+      <w:proofErr w:type="spellStart"/>
+      <w:r>
+        <w:rPr>
+          <w:rStyle w:val="Textoennegrita"/>
+          <w:rFonts w:ascii="Palatino Linotype" w:eastAsiaTheme="majorEastAsia" w:hAnsi="Palatino Linotype" w:cstheme="majorBidi"/>
+          <w:b w:val="0"/>
+          <w:bCs w:val="0"/>
+          <w:color w:val="000000"/>
+          <w:sz w:val="22"/>
+          <w:szCs w:val="22"/>
+          <w:lang w:val="en-US"/>
+        </w:rPr>
+        <w:t>actualizada</w:t>
+      </w:r>
+      <w:proofErr w:type="spellEnd"/>
+    </w:p>
+    <w:p>
+      <w:pPr>
+        <w:rPr>
+          <w:rStyle w:val="Textoennegrita"/>
+          <w:rFonts w:ascii="Palatino Linotype" w:eastAsiaTheme="majorEastAsia" w:hAnsi="Palatino Linotype" w:cstheme="majorBidi"/>
+          <w:b w:val="0"/>
+          <w:bCs w:val="0"/>
+          <w:color w:val="000000"/>
+          <w:sz w:val="22"/>
+          <w:szCs w:val="22"/>
+          <w:lang w:val="en-US"/>
+        </w:rPr>
+      </w:pPr>
+    </w:p>
+    <w:p>
+      <w:pPr>
+        <w:rPr>
+          <w:rStyle w:val="Textoennegrita"/>
+          <w:rFonts w:ascii="Palatino Linotype" w:eastAsiaTheme="majorEastAsia" w:hAnsi="Palatino Linotype" w:cstheme="majorBidi"/>
+          <w:b w:val="0"/>
+          <w:bCs w:val="0"/>
+          <w:color w:val="000000"/>
+          <w:sz w:val="22"/>
+          <w:szCs w:val="22"/>
+          <w:lang w:val="en-US"/>
+        </w:rPr>
+      </w:pPr>
+      <w:r>
+        <w:rPr>
+          <w:rStyle w:val="Textoennegrita"/>
+          <w:rFonts w:ascii="Palatino Linotype" w:eastAsiaTheme="majorEastAsia" w:hAnsi="Palatino Linotype" w:cstheme="majorBidi"/>
+          <w:b w:val="0"/>
+          <w:bCs w:val="0"/>
+          <w:color w:val="000000"/>
+          <w:sz w:val="22"/>
+          <w:szCs w:val="22"/>
+          <w:lang w:val="en-US"/>
+        </w:rPr>
+        <w:t xml:space="preserve">Re escribe de forma </w:t>
+      </w:r>
+      <w:proofErr w:type="spellStart"/>
+      <w:r>
+        <w:rPr>
+          <w:rStyle w:val="Textoennegrita"/>
+          <w:rFonts w:ascii="Palatino Linotype" w:eastAsiaTheme="majorEastAsia" w:hAnsi="Palatino Linotype" w:cstheme="majorBidi"/>
+          <w:b w:val="0"/>
+          <w:bCs w:val="0"/>
+          <w:color w:val="000000"/>
+          <w:sz w:val="22"/>
+          <w:szCs w:val="22"/>
+          <w:lang w:val="en-US"/>
+        </w:rPr>
+        <w:t>separada</w:t>
+      </w:r>
+      <w:proofErr w:type="spellEnd"/>
+      <w:r>
+        <w:rPr>
+          <w:rStyle w:val="Textoennegrita"/>
+          <w:rFonts w:ascii="Palatino Linotype" w:eastAsiaTheme="majorEastAsia" w:hAnsi="Palatino Linotype" w:cstheme="majorBidi"/>
+          <w:b w:val="0"/>
+          <w:bCs w:val="0"/>
+          <w:color w:val="000000"/>
+          <w:sz w:val="22"/>
+          <w:szCs w:val="22"/>
+          <w:lang w:val="en-US"/>
+        </w:rPr>
+        <w:t xml:space="preserve"> y </w:t>
+      </w:r>
+      <w:proofErr w:type="spellStart"/>
+      <w:r>
+        <w:rPr>
+          <w:rStyle w:val="Textoennegrita"/>
+          <w:rFonts w:ascii="Palatino Linotype" w:eastAsiaTheme="majorEastAsia" w:hAnsi="Palatino Linotype" w:cstheme="majorBidi"/>
+          <w:b w:val="0"/>
+          <w:bCs w:val="0"/>
+          <w:color w:val="000000"/>
+          <w:sz w:val="22"/>
+          <w:szCs w:val="22"/>
+          <w:lang w:val="en-US"/>
+        </w:rPr>
+        <w:t>completa</w:t>
+      </w:r>
+      <w:proofErr w:type="spellEnd"/>
+      <w:r>
+        <w:rPr>
+          <w:rStyle w:val="Textoennegrita"/>
+          <w:rFonts w:ascii="Palatino Linotype" w:eastAsiaTheme="majorEastAsia" w:hAnsi="Palatino Linotype" w:cstheme="majorBidi"/>
+          <w:b w:val="0"/>
+          <w:bCs w:val="0"/>
+          <w:color w:val="000000"/>
+          <w:sz w:val="22"/>
+          <w:szCs w:val="22"/>
+          <w:lang w:val="en-US"/>
+        </w:rPr>
+        <w:t xml:space="preserve"> </w:t>
+      </w:r>
+      <w:proofErr w:type="spellStart"/>
+      <w:r>
+        <w:rPr>
+          <w:rStyle w:val="Textoennegrita"/>
+          <w:rFonts w:ascii="Palatino Linotype" w:eastAsiaTheme="majorEastAsia" w:hAnsi="Palatino Linotype" w:cstheme="majorBidi"/>
+          <w:b w:val="0"/>
+          <w:bCs w:val="0"/>
+          <w:color w:val="000000"/>
+          <w:sz w:val="22"/>
+          <w:szCs w:val="22"/>
+          <w:lang w:val="en-US"/>
+        </w:rPr>
+        <w:t>todo</w:t>
+      </w:r>
+      <w:proofErr w:type="spellEnd"/>
+      <w:r>
+        <w:rPr>
+          <w:rStyle w:val="Textoennegrita"/>
+          <w:rFonts w:ascii="Palatino Linotype" w:eastAsiaTheme="majorEastAsia" w:hAnsi="Palatino Linotype" w:cstheme="majorBidi"/>
+          <w:b w:val="0"/>
+          <w:bCs w:val="0"/>
+          <w:color w:val="000000"/>
+          <w:sz w:val="22"/>
+          <w:szCs w:val="22"/>
+          <w:lang w:val="en-US"/>
+        </w:rPr>
+        <w:t xml:space="preserve"> </w:t>
+      </w:r>
+      <w:proofErr w:type="spellStart"/>
+      <w:r>
+        <w:rPr>
+          <w:rStyle w:val="Textoennegrita"/>
+          <w:rFonts w:ascii="Palatino Linotype" w:eastAsiaTheme="majorEastAsia" w:hAnsi="Palatino Linotype" w:cstheme="majorBidi"/>
+          <w:b w:val="0"/>
+          <w:bCs w:val="0"/>
+          <w:color w:val="000000"/>
+          <w:sz w:val="22"/>
+          <w:szCs w:val="22"/>
+          <w:lang w:val="en-US"/>
+        </w:rPr>
+        <w:t>el</w:t>
+      </w:r>
+      <w:proofErr w:type="spellEnd"/>
+      <w:r>
+        <w:rPr>
+          <w:rStyle w:val="Textoennegrita"/>
+          <w:rFonts w:ascii="Palatino Linotype" w:eastAsiaTheme="majorEastAsia" w:hAnsi="Palatino Linotype" w:cstheme="majorBidi"/>
+          <w:b w:val="0"/>
+          <w:bCs w:val="0"/>
+          <w:color w:val="000000"/>
+          <w:sz w:val="22"/>
+          <w:szCs w:val="22"/>
+          <w:lang w:val="en-US"/>
+        </w:rPr>
+        <w:t xml:space="preserve"> </w:t>
+      </w:r>
+      <w:proofErr w:type="spellStart"/>
+      <w:r>
+        <w:rPr>
+          <w:rStyle w:val="Textoennegrita"/>
+          <w:rFonts w:ascii="Palatino Linotype" w:eastAsiaTheme="majorEastAsia" w:hAnsi="Palatino Linotype" w:cstheme="majorBidi"/>
+          <w:b w:val="0"/>
+          <w:bCs w:val="0"/>
+          <w:color w:val="000000"/>
+          <w:sz w:val="22"/>
+          <w:szCs w:val="22"/>
+          <w:lang w:val="en-US"/>
+        </w:rPr>
+        <w:t>codigo</w:t>
+      </w:r>
+      <w:proofErr w:type="spellEnd"/>
+      <w:r>
+        <w:rPr>
+          <w:rStyle w:val="Textoennegrita"/>
+          <w:rFonts w:ascii="Palatino Linotype" w:eastAsiaTheme="majorEastAsia" w:hAnsi="Palatino Linotype" w:cstheme="majorBidi"/>
+          <w:b w:val="0"/>
+          <w:bCs w:val="0"/>
+          <w:color w:val="000000"/>
+          <w:sz w:val="22"/>
+          <w:szCs w:val="22"/>
+          <w:lang w:val="en-US"/>
+        </w:rPr>
+        <w:t xml:space="preserve"> </w:t>
+      </w:r>
+    </w:p>
+    <w:p>
+      <w:pPr>
+        <w:rPr>
+          <w:rStyle w:val="Textoennegrita"/>
+          <w:rFonts w:ascii="Palatino Linotype" w:eastAsiaTheme="majorEastAsia" w:hAnsi="Palatino Linotype" w:cstheme="majorBidi"/>
+          <w:b w:val="0"/>
+          <w:bCs w:val="0"/>
+          <w:color w:val="000000"/>
+          <w:sz w:val="22"/>
+          <w:szCs w:val="22"/>
+          <w:lang w:val="en-US"/>
+        </w:rPr>
+      </w:pPr>
+    </w:p>
+    <w:p>
+      <w:pPr>
+        <w:rPr>
+          <w:lang w:val="en-US"/>
+        </w:rPr>
+      </w:pPr>
+    </w:p>
+    <w:p>
+      <w:pPr>
+        <w:pStyle w:val="Ttulo3"/>
+        <w:spacing w:line="276" w:lineRule="auto"/>
+        <w:rPr>
+          <w:rStyle w:val="Textoennegrita"/>
+          <w:rFonts w:ascii="Palatino Linotype" w:hAnsi="Palatino Linotype"/>
+          <w:color w:val="000000"/>
+          <w:sz w:val="22"/>
+          <w:szCs w:val="22"/>
+          <w:lang w:val="en-US"/>
+        </w:rPr>
+      </w:pPr>
+      <w:r>
+        <w:rPr>
+          <w:rStyle w:val="Textoennegrita"/>
+          <w:rFonts w:ascii="Palatino Linotype" w:hAnsi="Palatino Linotype"/>
+          <w:color w:val="000000"/>
+          <w:sz w:val="22"/>
+          <w:szCs w:val="22"/>
+          <w:lang w:val="en-US"/>
+        </w:rPr>
+        <w:br/>
+      </w:r>
+    </w:p>
+    <w:p>
+      <w:pPr>
+        <w:pStyle w:val="Ttulo3"/>
+        <w:spacing w:line="276" w:lineRule="auto"/>
+        <w:rPr>
+          <w:rStyle w:val="Textoennegrita"/>
+          <w:rFonts w:ascii="Palatino Linotype" w:hAnsi="Palatino Linotype"/>
+          <w:color w:val="000000"/>
+          <w:sz w:val="22"/>
+          <w:szCs w:val="22"/>
+          <w:lang w:val="en-US"/>
+        </w:rPr>
+      </w:pPr>
+    </w:p>
+    <w:p>
+      <w:pPr>
+        <w:pStyle w:val="Ttulo3"/>
+        <w:spacing w:line="276" w:lineRule="auto"/>
         <w:jc w:val="both"/>
         <w:rPr>
           <w:rStyle w:val="Textoennegrita"/>
@@ -16,16 +2389,275 @@
           <w:lang w:val="en-US"/>
         </w:rPr>
       </w:pPr>
-      <w:r>
-        <w:rPr>
-          <w:rStyle w:val="Textoennegrita"/>
-          <w:rFonts w:ascii="Palatino Linotype" w:hAnsi="Palatino Linotype"/>
-          <w:color w:val="000000"/>
-          <w:sz w:val="22"/>
-          <w:szCs w:val="22"/>
-          <w:lang w:val="en-US"/>
-        </w:rPr>
-        <w:t>Funded Research Projects</w:t>
+    </w:p>
+    <w:p>
+      <w:pPr>
+        <w:pStyle w:val="Ttulo3"/>
+        <w:spacing w:line="276" w:lineRule="auto"/>
+        <w:jc w:val="both"/>
+        <w:rPr>
+          <w:rStyle w:val="Textoennegrita"/>
+          <w:rFonts w:ascii="Palatino Linotype" w:hAnsi="Palatino Linotype"/>
+          <w:color w:val="000000"/>
+          <w:sz w:val="22"/>
+          <w:szCs w:val="22"/>
+          <w:lang w:val="en-US"/>
+        </w:rPr>
+      </w:pPr>
+    </w:p>
+    <w:p>
+      <w:pPr>
+        <w:pStyle w:val="NormalWeb"/>
+        <w:numPr>
+          <w:ilvl w:val="0"/>
+          <w:numId w:val="28"/>
+        </w:numPr>
+        <w:spacing w:line="276" w:lineRule="auto"/>
+        <w:jc w:val="both"/>
+        <w:rPr>
+          <w:rStyle w:val="Textoennegrita"/>
+          <w:rFonts w:ascii="Palatino Linotype" w:hAnsi="Palatino Linotype"/>
+          <w:color w:val="000000"/>
+          <w:sz w:val="22"/>
+          <w:szCs w:val="22"/>
+          <w:lang w:val="en-US"/>
+        </w:rPr>
+      </w:pPr>
+      <w:r>
+        <w:rPr>
+          <w:rStyle w:val="Textoennegrita"/>
+          <w:rFonts w:ascii="Palatino Linotype" w:hAnsi="Palatino Linotype"/>
+          <w:color w:val="000000"/>
+          <w:sz w:val="22"/>
+          <w:szCs w:val="22"/>
+          <w:lang w:val="en-US"/>
+        </w:rPr>
+        <w:t xml:space="preserve">Changes in spermatogenesis, energy </w:t>
+      </w:r>
+      <w:proofErr w:type="spellStart"/>
+      <w:r>
+        <w:rPr>
+          <w:rStyle w:val="Textoennegrita"/>
+          <w:rFonts w:ascii="Palatino Linotype" w:hAnsi="Palatino Linotype"/>
+          <w:color w:val="000000"/>
+          <w:sz w:val="22"/>
+          <w:szCs w:val="22"/>
+          <w:lang w:val="en-US"/>
+        </w:rPr>
+        <w:t>metabolism</w:t>
+      </w:r>
+      <w:proofErr w:type="spellEnd"/>
+      <w:r>
+        <w:rPr>
+          <w:rStyle w:val="Textoennegrita"/>
+          <w:rFonts w:ascii="Palatino Linotype" w:hAnsi="Palatino Linotype"/>
+          <w:color w:val="000000"/>
+          <w:sz w:val="22"/>
+          <w:szCs w:val="22"/>
+          <w:lang w:val="en-US"/>
+        </w:rPr>
+        <w:t xml:space="preserve"> and oxidative stress in </w:t>
+      </w:r>
+      <w:proofErr w:type="spellStart"/>
+      <w:r>
+        <w:rPr>
+          <w:rStyle w:val="Textoennegrita"/>
+          <w:rFonts w:ascii="Palatino Linotype" w:hAnsi="Palatino Linotype"/>
+          <w:color w:val="000000"/>
+          <w:sz w:val="22"/>
+          <w:szCs w:val="22"/>
+          <w:lang w:val="en-US"/>
+        </w:rPr>
+        <w:t>the</w:t>
+      </w:r>
+      <w:proofErr w:type="spellEnd"/>
+      <w:r>
+        <w:rPr>
+          <w:rStyle w:val="Textoennegrita"/>
+          <w:rFonts w:ascii="Palatino Linotype" w:hAnsi="Palatino Linotype"/>
+          <w:color w:val="000000"/>
+          <w:sz w:val="22"/>
+          <w:szCs w:val="22"/>
+          <w:lang w:val="en-US"/>
+        </w:rPr>
+        <w:t xml:space="preserve"> </w:t>
+      </w:r>
+      <w:proofErr w:type="spellStart"/>
+      <w:r>
+        <w:rPr>
+          <w:rStyle w:val="Textoennegrita"/>
+          <w:rFonts w:ascii="Palatino Linotype" w:hAnsi="Palatino Linotype"/>
+          <w:color w:val="000000"/>
+          <w:sz w:val="22"/>
+          <w:szCs w:val="22"/>
+          <w:lang w:val="en-US"/>
+        </w:rPr>
+        <w:t>adult</w:t>
+      </w:r>
+      <w:proofErr w:type="spellEnd"/>
+      <w:r>
+        <w:rPr>
+          <w:rStyle w:val="Textoennegrita"/>
+          <w:rFonts w:ascii="Palatino Linotype" w:hAnsi="Palatino Linotype"/>
+          <w:color w:val="000000"/>
+          <w:sz w:val="22"/>
+          <w:szCs w:val="22"/>
+          <w:lang w:val="en-US"/>
+        </w:rPr>
+        <w:t xml:space="preserve"> </w:t>
+      </w:r>
+      <w:proofErr w:type="spellStart"/>
+      <w:r>
+        <w:rPr>
+          <w:rStyle w:val="Textoennegrita"/>
+          <w:rFonts w:ascii="Palatino Linotype" w:hAnsi="Palatino Linotype"/>
+          <w:color w:val="000000"/>
+          <w:sz w:val="22"/>
+          <w:szCs w:val="22"/>
+          <w:lang w:val="en-US"/>
+        </w:rPr>
+        <w:t>testis</w:t>
+      </w:r>
+      <w:proofErr w:type="spellEnd"/>
+      <w:r>
+        <w:rPr>
+          <w:rStyle w:val="Textoennegrita"/>
+          <w:rFonts w:ascii="Palatino Linotype" w:hAnsi="Palatino Linotype"/>
+          <w:color w:val="000000"/>
+          <w:sz w:val="22"/>
+          <w:szCs w:val="22"/>
+          <w:lang w:val="en-US"/>
+        </w:rPr>
+        <w:t xml:space="preserve"> induced by maternal exposure</w:t>
+      </w:r>
+    </w:p>
+    <w:p>
+      <w:pPr>
+        <w:pStyle w:val="NormalWeb"/>
+        <w:spacing w:line="276" w:lineRule="auto"/>
+        <w:ind w:firstLine="708"/>
+        <w:jc w:val="both"/>
+        <w:rPr>
+          <w:rStyle w:val="Textoennegrita"/>
+          <w:rFonts w:ascii="Palatino Linotype" w:hAnsi="Palatino Linotype"/>
+          <w:b w:val="0"/>
+          <w:bCs w:val="0"/>
+          <w:color w:val="000000"/>
+          <w:sz w:val="22"/>
+          <w:szCs w:val="22"/>
+          <w:lang w:val="en-US"/>
+        </w:rPr>
+      </w:pPr>
+      <w:r>
+        <w:rPr>
+          <w:rStyle w:val="Textoennegrita"/>
+          <w:rFonts w:ascii="Palatino Linotype" w:hAnsi="Palatino Linotype"/>
+          <w:b w:val="0"/>
+          <w:bCs w:val="0"/>
+          <w:i/>
+          <w:iCs/>
+          <w:color w:val="000000"/>
+          <w:sz w:val="22"/>
+          <w:szCs w:val="22"/>
+          <w:lang w:val="en-US"/>
+        </w:rPr>
+        <w:t xml:space="preserve">Pontificia Universidad </w:t>
+      </w:r>
+      <w:proofErr w:type="spellStart"/>
+      <w:r>
+        <w:rPr>
+          <w:rStyle w:val="Textoennegrita"/>
+          <w:rFonts w:ascii="Palatino Linotype" w:hAnsi="Palatino Linotype"/>
+          <w:b w:val="0"/>
+          <w:bCs w:val="0"/>
+          <w:i/>
+          <w:iCs/>
+          <w:color w:val="000000"/>
+          <w:sz w:val="22"/>
+          <w:szCs w:val="22"/>
+          <w:lang w:val="en-US"/>
+        </w:rPr>
+        <w:t>Católica</w:t>
+      </w:r>
+      <w:proofErr w:type="spellEnd"/>
+      <w:r>
+        <w:rPr>
+          <w:rStyle w:val="Textoennegrita"/>
+          <w:rFonts w:ascii="Palatino Linotype" w:hAnsi="Palatino Linotype"/>
+          <w:b w:val="0"/>
+          <w:bCs w:val="0"/>
+          <w:i/>
+          <w:iCs/>
+          <w:color w:val="000000"/>
+          <w:sz w:val="22"/>
+          <w:szCs w:val="22"/>
+          <w:lang w:val="en-US"/>
+        </w:rPr>
+        <w:t xml:space="preserve"> de Valparaíso. </w:t>
+      </w:r>
+      <w:proofErr w:type="spellStart"/>
+      <w:r>
+        <w:rPr>
+          <w:rStyle w:val="Textoennegrita"/>
+          <w:rFonts w:ascii="Palatino Linotype" w:hAnsi="Palatino Linotype"/>
+          <w:b w:val="0"/>
+          <w:bCs w:val="0"/>
+          <w:i/>
+          <w:iCs/>
+          <w:color w:val="000000"/>
+          <w:sz w:val="22"/>
+          <w:szCs w:val="22"/>
+          <w:lang w:val="en-US"/>
+        </w:rPr>
+        <w:t>Research</w:t>
+      </w:r>
+      <w:proofErr w:type="spellEnd"/>
+      <w:r>
+        <w:rPr>
+          <w:rStyle w:val="Textoennegrita"/>
+          <w:rFonts w:ascii="Palatino Linotype" w:hAnsi="Palatino Linotype"/>
+          <w:b w:val="0"/>
+          <w:bCs w:val="0"/>
+          <w:i/>
+          <w:iCs/>
+          <w:color w:val="000000"/>
+          <w:sz w:val="22"/>
+          <w:szCs w:val="22"/>
+          <w:lang w:val="en-US"/>
+        </w:rPr>
+        <w:t xml:space="preserve"> and </w:t>
+      </w:r>
+      <w:proofErr w:type="spellStart"/>
+      <w:r>
+        <w:rPr>
+          <w:rStyle w:val="Textoennegrita"/>
+          <w:rFonts w:ascii="Palatino Linotype" w:hAnsi="Palatino Linotype"/>
+          <w:b w:val="0"/>
+          <w:bCs w:val="0"/>
+          <w:i/>
+          <w:iCs/>
+          <w:color w:val="000000"/>
+          <w:sz w:val="22"/>
+          <w:szCs w:val="22"/>
+          <w:lang w:val="en-US"/>
+        </w:rPr>
+        <w:t>Advanced</w:t>
+      </w:r>
+      <w:proofErr w:type="spellEnd"/>
+      <w:r>
+        <w:rPr>
+          <w:rStyle w:val="Textoennegrita"/>
+          <w:rFonts w:ascii="Palatino Linotype" w:hAnsi="Palatino Linotype"/>
+          <w:b w:val="0"/>
+          <w:bCs w:val="0"/>
+          <w:i/>
+          <w:iCs/>
+          <w:color w:val="000000"/>
+          <w:sz w:val="22"/>
+          <w:szCs w:val="22"/>
+          <w:lang w:val="en-US"/>
+        </w:rPr>
+        <w:t xml:space="preserve"> Studies Directorate (DI 039.703/2025)</w:t>
       </w:r>
     </w:p>
     <w:p>
@@ -494,8 +3126,20 @@
           <w:szCs w:val="22"/>
           <w:lang w:val="en-US"/>
         </w:rPr>
-        <w:t>), in collaboration with Marine Harvest, Universidad de La Frontera (UFRO), and Universidad Santo Tomás (UST).*</w:t>
-      </w:r>
+        <w:t>), in collaboration with Marine Harvest, Universidad de La Frontera (UFRO), and Universidad Santo Tomás (UST</w:t>
+      </w:r>
+      <w:proofErr w:type="gramStart"/>
+      <w:r>
+        <w:rPr>
+          <w:rFonts w:ascii="Palatino Linotype" w:hAnsi="Palatino Linotype"/>
+          <w:color w:val="000000"/>
+          <w:sz w:val="22"/>
+          <w:szCs w:val="22"/>
+          <w:lang w:val="en-US"/>
+        </w:rPr>
+        <w:t>).*</w:t>
+      </w:r>
+      <w:proofErr w:type="gramEnd"/>
     </w:p>
     <w:p>
       <w:pPr>
@@ -505,13 +3149,8 @@
           <w:numId w:val="5"/>
         </w:numPr>
         <w:spacing w:line="276" w:lineRule="auto"/>
-        <w:jc w:val="both"/>
-        <w:rPr>
-          <w:rFonts w:ascii="Palatino Linotype" w:hAnsi="Palatino Linotype"/>
-          <w:color w:val="000000"/>
-          <w:sz w:val="22"/>
-          <w:szCs w:val="22"/>
-          <w:lang w:val="en-US"/>
+        <w:rPr>
+          <w:rStyle w:val="Textoennegrita"/>
         </w:rPr>
       </w:pPr>
       <w:r>
@@ -527,22 +3166,17 @@
       </w:r>
       <w:r>
         <w:rPr>
-          <w:rFonts w:ascii="Palatino Linotype" w:hAnsi="Palatino Linotype"/>
-          <w:color w:val="000000"/>
-          <w:sz w:val="22"/>
-          <w:szCs w:val="22"/>
-          <w:lang w:val="en-US"/>
+          <w:rStyle w:val="Textoennegrita"/>
         </w:rPr>
         <w:br/>
       </w:r>
       <w:r>
         <w:rPr>
-          <w:rStyle w:val="nfasis"/>
-          <w:rFonts w:ascii="Palatino Linotype" w:eastAsiaTheme="majorEastAsia" w:hAnsi="Palatino Linotype"/>
-          <w:color w:val="000000"/>
-          <w:sz w:val="22"/>
-          <w:szCs w:val="22"/>
-          <w:lang w:val="en-US"/>
+          <w:rStyle w:val="Textoennegrita"/>
+          <w:b w:val="0"/>
+          <w:bCs w:val="0"/>
+          <w:i/>
+          <w:iCs/>
         </w:rPr>
         <w:t>Morphological study of the effects of progestogen use as a contraceptive method on the uterus and uterine tubes in female dogs.</w:t>
       </w:r>
@@ -3589,6 +6223,118 @@
     </w:lvl>
   </w:abstractNum>
   <w:abstractNum w:abstractNumId="20" w15:restartNumberingAfterBreak="0">
+    <w:nsid w:val="6F56169C"/>
+    <w:multiLevelType w:val="hybridMultilevel"/>
+    <w:tmpl w:val="97449F54"/>
+    <w:lvl w:ilvl="0" w:tplc="340A0001">
+      <w:numFmt w:val="bullet"/>
+      <w:lvlText w:val=""/>
+      <w:lvlJc w:val="left"/>
+      <w:pPr>
+        <w:ind w:left="720" w:hanging="360"/>
+      </w:pPr>
+      <w:rPr>
+        <w:rFonts w:ascii="Symbol" w:eastAsia="Times New Roman" w:hAnsi="Symbol" w:cs="Times New Roman" w:hint="default"/>
+      </w:rPr>
+    </w:lvl>
+    <w:lvl w:ilvl="1" w:tplc="340A0003" w:tentative="1">
+      <w:start w:val="1"/>
+      <w:numFmt w:val="bullet"/>
+      <w:lvlText w:val="o"/>
+      <w:lvlJc w:val="left"/>
+      <w:pPr>
+        <w:ind w:left="1440" w:hanging="360"/>
+      </w:pPr>
+      <w:rPr>
+        <w:rFonts w:ascii="Courier New" w:hAnsi="Courier New" w:cs="Courier New" w:hint="default"/>
+      </w:rPr>
+    </w:lvl>
+    <w:lvl w:ilvl="2" w:tplc="340A0005" w:tentative="1">
+      <w:start w:val="1"/>
+      <w:numFmt w:val="bullet"/>
+      <w:lvlText w:val=""/>
+      <w:lvlJc w:val="left"/>
+      <w:pPr>
+        <w:ind w:left="2160" w:hanging="360"/>
+      </w:pPr>
+      <w:rPr>
+        <w:rFonts w:ascii="Wingdings" w:hAnsi="Wingdings" w:hint="default"/>
+      </w:rPr>
+    </w:lvl>
+    <w:lvl w:ilvl="3" w:tplc="340A0001" w:tentative="1">
+      <w:start w:val="1"/>
+      <w:numFmt w:val="bullet"/>
+      <w:lvlText w:val=""/>
+      <w:lvlJc w:val="left"/>
+      <w:pPr>
+        <w:ind w:left="2880" w:hanging="360"/>
+      </w:pPr>
+      <w:rPr>
+        <w:rFonts w:ascii="Symbol" w:hAnsi="Symbol" w:hint="default"/>
+      </w:rPr>
+    </w:lvl>
+    <w:lvl w:ilvl="4" w:tplc="340A0003" w:tentative="1">
+      <w:start w:val="1"/>
+      <w:numFmt w:val="bullet"/>
+      <w:lvlText w:val="o"/>
+      <w:lvlJc w:val="left"/>
+      <w:pPr>
+        <w:ind w:left="3600" w:hanging="360"/>
+      </w:pPr>
+      <w:rPr>
+        <w:rFonts w:ascii="Courier New" w:hAnsi="Courier New" w:cs="Courier New" w:hint="default"/>
+      </w:rPr>
+    </w:lvl>
+    <w:lvl w:ilvl="5" w:tplc="340A0005" w:tentative="1">
+      <w:start w:val="1"/>
+      <w:numFmt w:val="bullet"/>
+      <w:lvlText w:val=""/>
+      <w:lvlJc w:val="left"/>
+      <w:pPr>
+        <w:ind w:left="4320" w:hanging="360"/>
+      </w:pPr>
+      <w:rPr>
+        <w:rFonts w:ascii="Wingdings" w:hAnsi="Wingdings" w:hint="default"/>
+      </w:rPr>
+    </w:lvl>
+    <w:lvl w:ilvl="6" w:tplc="340A0001" w:tentative="1">
+      <w:start w:val="1"/>
+      <w:numFmt w:val="bullet"/>
+      <w:lvlText w:val=""/>
+      <w:lvlJc w:val="left"/>
+      <w:pPr>
+        <w:ind w:left="5040" w:hanging="360"/>
+      </w:pPr>
+      <w:rPr>
+        <w:rFonts w:ascii="Symbol" w:hAnsi="Symbol" w:hint="default"/>
+      </w:rPr>
+    </w:lvl>
+    <w:lvl w:ilvl="7" w:tplc="340A0003" w:tentative="1">
+      <w:start w:val="1"/>
+      <w:numFmt w:val="bullet"/>
+      <w:lvlText w:val="o"/>
+      <w:lvlJc w:val="left"/>
+      <w:pPr>
+        <w:ind w:left="5760" w:hanging="360"/>
+      </w:pPr>
+      <w:rPr>
+        <w:rFonts w:ascii="Courier New" w:hAnsi="Courier New" w:cs="Courier New" w:hint="default"/>
+      </w:rPr>
+    </w:lvl>
+    <w:lvl w:ilvl="8" w:tplc="340A0005" w:tentative="1">
+      <w:start w:val="1"/>
+      <w:numFmt w:val="bullet"/>
+      <w:lvlText w:val=""/>
+      <w:lvlJc w:val="left"/>
+      <w:pPr>
+        <w:ind w:left="6480" w:hanging="360"/>
+      </w:pPr>
+      <w:rPr>
+        <w:rFonts w:ascii="Wingdings" w:hAnsi="Wingdings" w:hint="default"/>
+      </w:rPr>
+    </w:lvl>
+  </w:abstractNum>
+  <w:abstractNum w:abstractNumId="21" w15:restartNumberingAfterBreak="0">
     <w:nsid w:val="70CF14B1"/>
     <w:multiLevelType w:val="multilevel"/>
     <w:tmpl w:val="E8C22236"/>
@@ -3737,7 +6483,7 @@
       </w:rPr>
     </w:lvl>
   </w:abstractNum>
-  <w:abstractNum w:abstractNumId="21" w15:restartNumberingAfterBreak="0">
+  <w:abstractNum w:abstractNumId="22" w15:restartNumberingAfterBreak="0">
     <w:nsid w:val="71337BDC"/>
     <w:multiLevelType w:val="multilevel"/>
     <w:tmpl w:val="FFCA6B98"/>
@@ -3886,7 +6632,7 @@
       </w:rPr>
     </w:lvl>
   </w:abstractNum>
-  <w:abstractNum w:abstractNumId="22" w15:restartNumberingAfterBreak="0">
+  <w:abstractNum w:abstractNumId="23" w15:restartNumberingAfterBreak="0">
     <w:nsid w:val="71E812D6"/>
     <w:multiLevelType w:val="multilevel"/>
     <w:tmpl w:val="B2248CEA"/>
@@ -4035,7 +6781,7 @@
       </w:rPr>
     </w:lvl>
   </w:abstractNum>
-  <w:abstractNum w:abstractNumId="23" w15:restartNumberingAfterBreak="0">
+  <w:abstractNum w:abstractNumId="24" w15:restartNumberingAfterBreak="0">
     <w:nsid w:val="743D247B"/>
     <w:multiLevelType w:val="multilevel"/>
     <w:tmpl w:val="81F07D2A"/>
@@ -4184,7 +6930,7 @@
       </w:rPr>
     </w:lvl>
   </w:abstractNum>
-  <w:abstractNum w:abstractNumId="24" w15:restartNumberingAfterBreak="0">
+  <w:abstractNum w:abstractNumId="25" w15:restartNumberingAfterBreak="0">
     <w:nsid w:val="76C65F96"/>
     <w:multiLevelType w:val="multilevel"/>
     <w:tmpl w:val="A5820314"/>
@@ -4333,7 +7079,7 @@
       </w:rPr>
     </w:lvl>
   </w:abstractNum>
-  <w:abstractNum w:abstractNumId="25" w15:restartNumberingAfterBreak="0">
+  <w:abstractNum w:abstractNumId="26" w15:restartNumberingAfterBreak="0">
     <w:nsid w:val="79AB5B7E"/>
     <w:multiLevelType w:val="multilevel"/>
     <w:tmpl w:val="716CA684"/>
@@ -4482,7 +7228,7 @@
       </w:rPr>
     </w:lvl>
   </w:abstractNum>
-  <w:abstractNum w:abstractNumId="26" w15:restartNumberingAfterBreak="0">
+  <w:abstractNum w:abstractNumId="27" w15:restartNumberingAfterBreak="0">
     <w:nsid w:val="79FF099D"/>
     <w:multiLevelType w:val="multilevel"/>
     <w:tmpl w:val="F43EB6B4"/>
@@ -4641,7 +7387,7 @@
     <w:abstractNumId w:val="7"/>
   </w:num>
   <w:num w:numId="4">
-    <w:abstractNumId w:val="24"/>
+    <w:abstractNumId w:val="25"/>
   </w:num>
   <w:num w:numId="5">
     <w:abstractNumId w:val="17"/>
@@ -4662,13 +7408,13 @@
     <w:abstractNumId w:val="14"/>
   </w:num>
   <w:num w:numId="11">
-    <w:abstractNumId w:val="26"/>
+    <w:abstractNumId w:val="27"/>
   </w:num>
   <w:num w:numId="12">
     <w:abstractNumId w:val="18"/>
   </w:num>
   <w:num w:numId="13">
-    <w:abstractNumId w:val="20"/>
+    <w:abstractNumId w:val="21"/>
   </w:num>
   <w:num w:numId="14">
     <w:abstractNumId w:val="11"/>
@@ -4677,7 +7423,7 @@
     <w:abstractNumId w:val="4"/>
   </w:num>
   <w:num w:numId="16">
-    <w:abstractNumId w:val="25"/>
+    <w:abstractNumId w:val="26"/>
   </w:num>
   <w:num w:numId="17">
     <w:abstractNumId w:val="2"/>
@@ -4692,7 +7438,7 @@
     <w:abstractNumId w:val="16"/>
   </w:num>
   <w:num w:numId="21">
-    <w:abstractNumId w:val="23"/>
+    <w:abstractNumId w:val="24"/>
   </w:num>
   <w:num w:numId="22">
     <w:abstractNumId w:val="0"/>
@@ -4704,13 +7450,16 @@
     <w:abstractNumId w:val="12"/>
   </w:num>
   <w:num w:numId="25">
-    <w:abstractNumId w:val="22"/>
+    <w:abstractNumId w:val="23"/>
   </w:num>
   <w:num w:numId="26">
-    <w:abstractNumId w:val="21"/>
+    <w:abstractNumId w:val="22"/>
   </w:num>
   <w:num w:numId="27">
     <w:abstractNumId w:val="15"/>
+  </w:num>
+  <w:num w:numId="28">
+    <w:abstractNumId w:val="20"/>
   </w:num>
 </w:numbering>
 </file>
@@ -5377,6 +8126,11 @@
       <w:rFonts w:eastAsiaTheme="minorEastAsia"/>
     </w:rPr>
   </w:style>
+  <w:style w:type="character" w:customStyle="1" w:styleId="gmaildefault">
+    <w:name w:val="gmail_default"/>
+    <w:basedOn w:val="Fuentedeprrafopredeter"/>
+    <w:rsid w:val="00230A9E"/>
+  </w:style>
 </w:styles>
 </file>
 

</xml_diff>